<commit_message>
Replace reference.docx's placeholder demo content with a realistic policy preview
</commit_message>
<xml_diff>
--- a/pandoc/reference.docx
+++ b/pandoc/reference.docx
@@ -7,15 +7,7 @@
         <w:pStyle w:val="Title"/>
       </w:pPr>
       <w:r>
-        <w:t xml:space="preserve">Title</w:t>
-      </w:r>
-    </w:p>
-    <w:p>
-      <w:pPr>
-        <w:pStyle w:val="Subtitle"/>
-      </w:pPr>
-      <w:r>
-        <w:t xml:space="preserve">Subtitle</w:t>
+        <w:t xml:space="preserve">Access Control Policy</w:t>
       </w:r>
     </w:p>
     <w:p>
@@ -23,7 +15,7 @@
         <w:pStyle w:val="Author"/>
       </w:pPr>
       <w:r>
-        <w:t xml:space="preserve">Author</w:t>
+        <w:t xml:space="preserve">TenX Protocols</w:t>
       </w:r>
     </w:p>
     <w:p>
@@ -31,291 +23,546 @@
         <w:pStyle w:val="Date"/>
       </w:pPr>
       <w:r>
-        <w:t xml:space="preserve">Date</w:t>
-      </w:r>
-    </w:p>
-    <w:p>
-      <w:pPr>
-        <w:pStyle w:val="Abstract"/>
-      </w:pPr>
-      <w:r>
-        <w:t xml:space="preserve">Abstract</w:t>
-      </w:r>
-    </w:p>
-    <w:p>
-      <w:pPr>
-        <w:pStyle w:val="Heading1"/>
-      </w:pPr>
-      <w:bookmarkStart w:id="21" w:name="heading-1"/>
-      <w:r>
-        <w:t xml:space="preserve">Heading 1</w:t>
-      </w:r>
-      <w:bookmarkEnd w:id="21"/>
-    </w:p>
+        <w:t xml:space="preserve">v1.0 — Confidential — Last updated 2026-06-30 — PREVIEW DOCUMENT, not an approved policy</w:t>
+      </w:r>
+    </w:p>
+    <w:sdt>
+      <w:sdtPr>
+        <w:docPartObj>
+          <w:docPartGallery w:val="Table of Contents"/>
+          <w:docPartUnique/>
+        </w:docPartObj>
+      </w:sdtPr>
+      <w:sdtContent>
+        <w:p>
+          <w:pPr>
+            <w:pStyle w:val="TOCHeading"/>
+          </w:pPr>
+          <w:r>
+            <w:t xml:space="preserve">Table of Contents</w:t>
+          </w:r>
+        </w:p>
+        <w:p>
+          <w:r>
+            <w:fldChar w:fldCharType="begin" w:dirty="true"/>
+            <w:instrText xml:space="preserve">TOC \o "1-3" \h \z \u</w:instrText>
+            <w:fldChar w:fldCharType="separate"/>
+            <w:fldChar w:fldCharType="end"/>
+          </w:r>
+        </w:p>
+      </w:sdtContent>
+    </w:sdt>
+    <w:p>
+      <w:r>
+        <w:br w:type="page"/>
+      </w:r>
+    </w:p>
+    <w:bookmarkStart w:id="19" w:name="purpose"/>
     <w:p>
       <w:pPr>
         <w:pStyle w:val="Heading2"/>
       </w:pPr>
-      <w:bookmarkStart w:id="22" w:name="heading-2"/>
-      <w:r>
-        <w:t xml:space="preserve">Heading 2</w:t>
-      </w:r>
-      <w:bookmarkEnd w:id="22"/>
-    </w:p>
+      <w:r>
+        <w:t xml:space="preserve">Purpose</w:t>
+      </w:r>
+    </w:p>
+    <w:p>
+      <w:pPr>
+        <w:pStyle w:val="FirstParagraph"/>
+      </w:pPr>
+      <w:r>
+        <w:t xml:space="preserve">This policy defines how access to company systems and data is granted,</w:t>
+      </w:r>
+      <w:r>
+        <w:t xml:space="preserve"> </w:t>
+      </w:r>
+      <w:r>
+        <w:t xml:space="preserve">reviewed, and revoked. It exists to keep the blast radius of a compromised</w:t>
+      </w:r>
+      <w:r>
+        <w:t xml:space="preserve"> </w:t>
+      </w:r>
+      <w:r>
+        <w:t xml:space="preserve">account small, and to give auditors a clear, evidence-backed answer to</w:t>
+      </w:r>
+      <w:r>
+        <w:t xml:space="preserve"> </w:t>
+      </w:r>
+      <w:r>
+        <w:t xml:space="preserve">“who can touch what, and why.”</w:t>
+      </w:r>
+    </w:p>
+    <w:bookmarkEnd w:id="19"/>
+    <w:bookmarkStart w:id="22" w:name="scope"/>
+    <w:p>
+      <w:pPr>
+        <w:pStyle w:val="Heading2"/>
+      </w:pPr>
+      <w:r>
+        <w:t xml:space="preserve">Scope</w:t>
+      </w:r>
+    </w:p>
+    <w:p>
+      <w:pPr>
+        <w:pStyle w:val="FirstParagraph"/>
+      </w:pPr>
+      <w:r>
+        <w:t xml:space="preserve">This policy applies to every employee, contractor, and automated service</w:t>
+      </w:r>
+      <w:r>
+        <w:t xml:space="preserve"> </w:t>
+      </w:r>
+      <w:r>
+        <w:t xml:space="preserve">account with access to production systems, customer data, or internal</w:t>
+      </w:r>
+      <w:r>
+        <w:t xml:space="preserve"> </w:t>
+      </w:r>
+      <w:r>
+        <w:t xml:space="preserve">tooling. It does not cover physical access to office space, which is</w:t>
+      </w:r>
+      <w:r>
+        <w:t xml:space="preserve"> </w:t>
+      </w:r>
+      <w:r>
+        <w:t xml:space="preserve">governed separately.</w:t>
+      </w:r>
+    </w:p>
+    <w:bookmarkStart w:id="20" w:name="principle-of-least-privilege"/>
     <w:p>
       <w:pPr>
         <w:pStyle w:val="Heading3"/>
       </w:pPr>
-      <w:bookmarkStart w:id="23" w:name="heading-3"/>
-      <w:r>
-        <w:t xml:space="preserve">Heading 3</w:t>
-      </w:r>
-      <w:bookmarkEnd w:id="23"/>
-    </w:p>
-    <w:p>
-      <w:pPr>
-        <w:pStyle w:val="Heading4"/>
-      </w:pPr>
-      <w:bookmarkStart w:id="24" w:name="heading-4"/>
-      <w:r>
-        <w:t xml:space="preserve">Heading 4</w:t>
-      </w:r>
-      <w:bookmarkEnd w:id="24"/>
-    </w:p>
-    <w:p>
-      <w:pPr>
-        <w:pStyle w:val="Heading5"/>
-      </w:pPr>
-      <w:bookmarkStart w:id="25" w:name="heading-5"/>
-      <w:r>
-        <w:t xml:space="preserve">Heading 5</w:t>
-      </w:r>
-      <w:bookmarkEnd w:id="25"/>
-    </w:p>
-    <w:p>
-      <w:pPr>
-        <w:pStyle w:val="Heading6"/>
-      </w:pPr>
-      <w:bookmarkStart w:id="26" w:name="heading-6"/>
-      <w:r>
-        <w:t xml:space="preserve">Heading 6</w:t>
-      </w:r>
-      <w:bookmarkEnd w:id="26"/>
-    </w:p>
-    <w:p>
-      <w:pPr>
-        <w:pStyle w:val="Heading7"/>
-      </w:pPr>
-      <w:bookmarkStart w:id="27" w:name="heading-7"/>
-      <w:r>
-        <w:t xml:space="preserve">Heading 7</w:t>
-      </w:r>
-      <w:bookmarkEnd w:id="27"/>
-    </w:p>
-    <w:p>
-      <w:pPr>
-        <w:pStyle w:val="Heading8"/>
-      </w:pPr>
-      <w:bookmarkStart w:id="28" w:name="heading-8"/>
-      <w:r>
-        <w:t xml:space="preserve">Heading 8</w:t>
-      </w:r>
-      <w:bookmarkEnd w:id="28"/>
-    </w:p>
-    <w:p>
-      <w:pPr>
-        <w:pStyle w:val="Heading9"/>
-      </w:pPr>
-      <w:bookmarkStart w:id="29" w:name="heading-9"/>
-      <w:r>
-        <w:t xml:space="preserve">Heading 9</w:t>
-      </w:r>
-      <w:bookmarkEnd w:id="29"/>
+      <w:r>
+        <w:t xml:space="preserve">Principle of least privilege</w:t>
+      </w:r>
     </w:p>
     <w:p>
       <w:pPr>
         <w:pStyle w:val="FirstParagraph"/>
       </w:pPr>
       <w:r>
-        <w:t xml:space="preserve">First Paragraph.</w:t>
-      </w:r>
-    </w:p>
-    <w:p>
-      <w:pPr>
-        <w:pStyle w:val="BodyText"/>
-      </w:pPr>
-      <w:r>
-        <w:t xml:space="preserve">Body Text. Body Text Char.</w:t>
+        <w:t xml:space="preserve">Access is granted based on role, not tenure or convenience. A new hire on</w:t>
       </w:r>
       <w:r>
         <w:t xml:space="preserve"> </w:t>
       </w:r>
       <w:r>
-        <w:rPr>
-          <w:rStyle w:val="VerbatimChar"/>
-        </w:rPr>
-        <w:t xml:space="preserve">Verbatim Char</w:t>
-      </w:r>
-      <w:r>
-        <w:t xml:space="preserve">.</w:t>
+        <w:t xml:space="preserve">the platform team gets read access to staging logs on day one; write</w:t>
       </w:r>
       <w:r>
         <w:t xml:space="preserve"> </w:t>
       </w:r>
-      <w:hyperlink r:id="rId30">
-        <w:r>
-          <w:rPr>
-            <w:rStyle w:val="Hyperlink"/>
-          </w:rPr>
-          <w:t xml:space="preserve">Hyperlink</w:t>
-        </w:r>
-      </w:hyperlink>
-      <w:r>
-        <w:t xml:space="preserve">.</w:t>
+      <w:r>
+        <w:t xml:space="preserve">access to production infrastructure requires a specific, time-bound</w:t>
       </w:r>
       <w:r>
         <w:t xml:space="preserve"> </w:t>
       </w:r>
       <w:r>
-        <w:t xml:space="preserve">Footnote.</w:t>
-      </w:r>
-      <w:r>
-        <w:rPr>
-          <w:rStyle w:val="FootnoteReference"/>
-        </w:rPr>
-        <w:footnoteReference w:id="31"/>
-      </w:r>
-    </w:p>
-    <w:p>
-      <w:pPr>
-        <w:pStyle w:val="BlockText"/>
-      </w:pPr>
-      <w:r>
-        <w:t xml:space="preserve">Block Text.</w:t>
-      </w:r>
-    </w:p>
-    <w:p>
-      <w:pPr>
-        <w:pStyle w:val="TableCaption"/>
-      </w:pPr>
-      <w:r>
-        <w:t xml:space="preserve">Table caption.</w:t>
+        <w:t xml:space="preserve">request approved by their manager and a member of the security team.</w:t>
+      </w:r>
+    </w:p>
+    <w:bookmarkEnd w:id="20"/>
+    <w:bookmarkStart w:id="21" w:name="default-deny"/>
+    <w:p>
+      <w:pPr>
+        <w:pStyle w:val="Heading3"/>
+      </w:pPr>
+      <w:r>
+        <w:t xml:space="preserve">Default-deny</w:t>
+      </w:r>
+    </w:p>
+    <w:p>
+      <w:pPr>
+        <w:pStyle w:val="FirstParagraph"/>
+      </w:pPr>
+      <w:r>
+        <w:t xml:space="preserve">Systems default to no access. Every grant is a deliberate, logged action —</w:t>
+      </w:r>
+      <w:r>
+        <w:t xml:space="preserve"> </w:t>
+      </w:r>
+      <w:r>
+        <w:t xml:space="preserve">never an inherited default from a broader group unless that group’s own</w:t>
+      </w:r>
+      <w:r>
+        <w:t xml:space="preserve"> </w:t>
+      </w:r>
+      <w:r>
+        <w:t xml:space="preserve">access was itself deliberately scoped.</w:t>
+      </w:r>
+    </w:p>
+    <w:bookmarkEnd w:id="21"/>
+    <w:bookmarkEnd w:id="22"/>
+    <w:bookmarkStart w:id="23" w:name="access-review-cadence"/>
+    <w:p>
+      <w:pPr>
+        <w:pStyle w:val="Heading2"/>
+      </w:pPr>
+      <w:r>
+        <w:t xml:space="preserve">Access review cadence</w:t>
       </w:r>
     </w:p>
     <w:tbl>
       <w:tblPr>
         <w:tblStyle w:val="Table"/>
-        <w:tblLook w:firstRow="1"/>
-        <w:tblCaption w:val="Table caption."/>
+        <w:tblW w:type="pct" w:w="5000"/>
+        <w:tblLayout w:type="fixed"/>
+        <w:tblLook w:firstRow="1" w:lastRow="0" w:firstColumn="0" w:lastColumn="0" w:noHBand="0" w:noVBand="0" w:val="0020"/>
       </w:tblPr>
-      <w:tblGrid/>
+      <w:tblGrid>
+        <w:gridCol w:w="1980"/>
+        <w:gridCol w:w="1980"/>
+        <w:gridCol w:w="1980"/>
+        <w:gridCol w:w="1980"/>
+      </w:tblGrid>
       <w:tr>
         <w:trPr>
-          <w:cnfStyle w:firstRow="1" w:val="100000000000"/>
+          <w:tblHeader w:val="on"/>
         </w:trPr>
         <w:tc>
-          <w:tcPr>
-            <w:tcBorders>
-              <w:bottom w:val="single"/>
-            </w:tcBorders>
-            <w:vAlign w:val="bottom"/>
-          </w:tcPr>
+          <w:tcPr/>
           <w:p>
             <w:pPr>
               <w:pStyle w:val="Compact"/>
-              <w:jc w:val="left"/>
             </w:pPr>
             <w:r>
-              <w:t xml:space="preserve">Table</w:t>
+              <w:t xml:space="preserve">System</w:t>
             </w:r>
           </w:p>
         </w:tc>
         <w:tc>
-          <w:tcPr>
-            <w:tcBorders>
-              <w:bottom w:val="single"/>
-            </w:tcBorders>
-            <w:vAlign w:val="bottom"/>
-          </w:tcPr>
+          <w:tcPr/>
           <w:p>
             <w:pPr>
               <w:pStyle w:val="Compact"/>
-              <w:jc w:val="left"/>
             </w:pPr>
             <w:r>
-              <w:t xml:space="preserve">Table</w:t>
+              <w:t xml:space="preserve">Review frequency</w:t>
+            </w:r>
+          </w:p>
+        </w:tc>
+        <w:tc>
+          <w:tcPr/>
+          <w:p>
+            <w:pPr>
+              <w:pStyle w:val="Compact"/>
+            </w:pPr>
+            <w:r>
+              <w:t xml:space="preserve">Reviewer</w:t>
+            </w:r>
+          </w:p>
+        </w:tc>
+        <w:tc>
+          <w:tcPr/>
+          <w:p>
+            <w:pPr>
+              <w:pStyle w:val="Compact"/>
+            </w:pPr>
+            <w:r>
+              <w:t xml:space="preserve">Evidence</w:t>
             </w:r>
           </w:p>
         </w:tc>
       </w:tr>
       <w:tr>
         <w:tc>
+          <w:tcPr/>
           <w:p>
             <w:pPr>
               <w:pStyle w:val="Compact"/>
-              <w:jc w:val="left"/>
             </w:pPr>
             <w:r>
-              <w:t xml:space="preserve">1</w:t>
+              <w:t xml:space="preserve">Production AWS accounts</w:t>
             </w:r>
           </w:p>
         </w:tc>
         <w:tc>
+          <w:tcPr/>
           <w:p>
             <w:pPr>
               <w:pStyle w:val="Compact"/>
-              <w:jc w:val="left"/>
             </w:pPr>
             <w:r>
-              <w:t xml:space="preserve">2</w:t>
+              <w:t xml:space="preserve">Quarterly</w:t>
+            </w:r>
+          </w:p>
+        </w:tc>
+        <w:tc>
+          <w:tcPr/>
+          <w:p>
+            <w:pPr>
+              <w:pStyle w:val="Compact"/>
+            </w:pPr>
+            <w:r>
+              <w:t xml:space="preserve">Security lead</w:t>
+            </w:r>
+          </w:p>
+        </w:tc>
+        <w:tc>
+          <w:tcPr/>
+          <w:p>
+            <w:pPr>
+              <w:pStyle w:val="Compact"/>
+            </w:pPr>
+            <w:r>
+              <w:t xml:space="preserve">Signed access review checklist</w:t>
+            </w:r>
+          </w:p>
+        </w:tc>
+      </w:tr>
+      <w:tr>
+        <w:tc>
+          <w:tcPr/>
+          <w:p>
+            <w:pPr>
+              <w:pStyle w:val="Compact"/>
+            </w:pPr>
+            <w:r>
+              <w:t xml:space="preserve">Google Workspace admin</w:t>
+            </w:r>
+          </w:p>
+        </w:tc>
+        <w:tc>
+          <w:tcPr/>
+          <w:p>
+            <w:pPr>
+              <w:pStyle w:val="Compact"/>
+            </w:pPr>
+            <w:r>
+              <w:t xml:space="preserve">Quarterly</w:t>
+            </w:r>
+          </w:p>
+        </w:tc>
+        <w:tc>
+          <w:tcPr/>
+          <w:p>
+            <w:pPr>
+              <w:pStyle w:val="Compact"/>
+            </w:pPr>
+            <w:r>
+              <w:t xml:space="preserve">IT lead</w:t>
+            </w:r>
+          </w:p>
+        </w:tc>
+        <w:tc>
+          <w:tcPr/>
+          <w:p>
+            <w:pPr>
+              <w:pStyle w:val="Compact"/>
+            </w:pPr>
+            <w:r>
+              <w:t xml:space="preserve">Signed access review checklist</w:t>
+            </w:r>
+          </w:p>
+        </w:tc>
+      </w:tr>
+      <w:tr>
+        <w:tc>
+          <w:tcPr/>
+          <w:p>
+            <w:pPr>
+              <w:pStyle w:val="Compact"/>
+            </w:pPr>
+            <w:r>
+              <w:t xml:space="preserve">Source control (org owners)</w:t>
+            </w:r>
+          </w:p>
+        </w:tc>
+        <w:tc>
+          <w:tcPr/>
+          <w:p>
+            <w:pPr>
+              <w:pStyle w:val="Compact"/>
+            </w:pPr>
+            <w:r>
+              <w:t xml:space="preserve">Quarterly</w:t>
+            </w:r>
+          </w:p>
+        </w:tc>
+        <w:tc>
+          <w:tcPr/>
+          <w:p>
+            <w:pPr>
+              <w:pStyle w:val="Compact"/>
+            </w:pPr>
+            <w:r>
+              <w:t xml:space="preserve">Engineering lead</w:t>
+            </w:r>
+          </w:p>
+        </w:tc>
+        <w:tc>
+          <w:tcPr/>
+          <w:p>
+            <w:pPr>
+              <w:pStyle w:val="Compact"/>
+            </w:pPr>
+            <w:r>
+              <w:t xml:space="preserve">Signed access review checklist</w:t>
+            </w:r>
+          </w:p>
+        </w:tc>
+      </w:tr>
+      <w:tr>
+        <w:tc>
+          <w:tcPr/>
+          <w:p>
+            <w:pPr>
+              <w:pStyle w:val="Compact"/>
+            </w:pPr>
+            <w:r>
+              <w:t xml:space="preserve">Customer data warehouse</w:t>
+            </w:r>
+          </w:p>
+        </w:tc>
+        <w:tc>
+          <w:tcPr/>
+          <w:p>
+            <w:pPr>
+              <w:pStyle w:val="Compact"/>
+            </w:pPr>
+            <w:r>
+              <w:t xml:space="preserve">Monthly</w:t>
+            </w:r>
+          </w:p>
+        </w:tc>
+        <w:tc>
+          <w:tcPr/>
+          <w:p>
+            <w:pPr>
+              <w:pStyle w:val="Compact"/>
+            </w:pPr>
+            <w:r>
+              <w:t xml:space="preserve">Data lead</w:t>
+            </w:r>
+          </w:p>
+        </w:tc>
+        <w:tc>
+          <w:tcPr/>
+          <w:p>
+            <w:pPr>
+              <w:pStyle w:val="Compact"/>
+            </w:pPr>
+            <w:r>
+              <w:t xml:space="preserve">Signed access review checklist</w:t>
             </w:r>
           </w:p>
         </w:tc>
       </w:tr>
     </w:tbl>
-    <w:p>
-      <w:pPr>
-        <w:pStyle w:val="ImageCaption"/>
-      </w:pPr>
-      <w:r>
-        <w:t xml:space="preserve">Image Caption</w:t>
-      </w:r>
-    </w:p>
-    <w:p>
-      <w:pPr>
-        <w:pStyle w:val="DefinitionTerm"/>
-      </w:pPr>
-      <w:r>
-        <w:t xml:space="preserve">DefinitionTerm</w:t>
-      </w:r>
-    </w:p>
-    <w:p>
-      <w:pPr>
-        <w:pStyle w:val="Definition"/>
-      </w:pPr>
-      <w:r>
-        <w:t xml:space="preserve">Definition</w:t>
-      </w:r>
-    </w:p>
-    <w:p>
-      <w:pPr>
-        <w:pStyle w:val="DefinitionTerm"/>
-      </w:pPr>
-      <w:r>
-        <w:t xml:space="preserve">DefinitionTerm</w:t>
-      </w:r>
-    </w:p>
-    <w:p>
-      <w:pPr>
-        <w:pStyle w:val="Definition"/>
-      </w:pPr>
-      <w:r>
-        <w:t xml:space="preserve">Definition</w:t>
-      </w:r>
-    </w:p>
+    <w:bookmarkEnd w:id="23"/>
+    <w:bookmarkStart w:id="24" w:name="offboarding"/>
+    <w:p>
+      <w:pPr>
+        <w:pStyle w:val="Heading2"/>
+      </w:pPr>
+      <w:r>
+        <w:t xml:space="preserve">Offboarding</w:t>
+      </w:r>
+    </w:p>
+    <w:p>
+      <w:pPr>
+        <w:pStyle w:val="FirstParagraph"/>
+      </w:pPr>
+      <w:r>
+        <w:t xml:space="preserve">When an employee or contractor’s engagement ends, access is revoked the</w:t>
+      </w:r>
+      <w:r>
+        <w:t xml:space="preserve"> </w:t>
+      </w:r>
+      <w:r>
+        <w:t xml:space="preserve">same business day. This includes:</w:t>
+      </w:r>
+    </w:p>
+    <w:p>
+      <w:pPr>
+        <w:pStyle w:val="Compact"/>
+        <w:numPr>
+          <w:ilvl w:val="0"/>
+          <w:numId w:val="1001"/>
+        </w:numPr>
+      </w:pPr>
+      <w:r>
+        <w:t xml:space="preserve">SSO/identity provider account disabled</w:t>
+      </w:r>
+    </w:p>
+    <w:p>
+      <w:pPr>
+        <w:pStyle w:val="Compact"/>
+        <w:numPr>
+          <w:ilvl w:val="0"/>
+          <w:numId w:val="1001"/>
+        </w:numPr>
+      </w:pPr>
+      <w:r>
+        <w:t xml:space="preserve">All third-party SaaS integrations tied to their identity revoked</w:t>
+      </w:r>
+    </w:p>
+    <w:p>
+      <w:pPr>
+        <w:pStyle w:val="Compact"/>
+        <w:numPr>
+          <w:ilvl w:val="0"/>
+          <w:numId w:val="1001"/>
+        </w:numPr>
+      </w:pPr>
+      <w:r>
+        <w:t xml:space="preserve">Any shared credentials they had knowledge of rotated</w:t>
+      </w:r>
+    </w:p>
+    <w:p>
+      <w:pPr>
+        <w:pStyle w:val="Compact"/>
+        <w:numPr>
+          <w:ilvl w:val="0"/>
+          <w:numId w:val="1001"/>
+        </w:numPr>
+      </w:pPr>
+      <w:r>
+        <w:t xml:space="preserve">Physical badge and hardware returned or remotely wiped</w:t>
+      </w:r>
+    </w:p>
+    <w:bookmarkEnd w:id="24"/>
+    <w:bookmarkStart w:id="25" w:name="exceptions"/>
+    <w:p>
+      <w:pPr>
+        <w:pStyle w:val="Heading2"/>
+      </w:pPr>
+      <w:r>
+        <w:t xml:space="preserve">Exceptions</w:t>
+      </w:r>
+    </w:p>
+    <w:p>
+      <w:pPr>
+        <w:pStyle w:val="FirstParagraph"/>
+      </w:pPr>
+      <w:r>
+        <w:t xml:space="preserve">Any deviation from this policy requires written approval from the</w:t>
+      </w:r>
+      <w:r>
+        <w:t xml:space="preserve"> </w:t>
+      </w:r>
+      <w:r>
+        <w:t xml:space="preserve">security lead, with a documented business justification and an expiry</w:t>
+      </w:r>
+      <w:r>
+        <w:t xml:space="preserve"> </w:t>
+      </w:r>
+      <w:r>
+        <w:t xml:space="preserve">date. Standing exceptions are reviewed at the same cadence as regular</w:t>
+      </w:r>
+      <w:r>
+        <w:t xml:space="preserve"> </w:t>
+      </w:r>
+      <w:r>
+        <w:t xml:space="preserve">access reviews above.</w:t>
+      </w:r>
+    </w:p>
+    <w:bookmarkEnd w:id="25"/>
     <w:sectPr>
-      <w:footerReference w:type="default" r:id="rId9"/>
-      <w:headerReference w:type="default" r:id="rId10"/>
+      <w:footerReference r:id="rId9" w:type="default"/>
+      <w:headerReference r:id="rId10" w:type="default"/>
       <w:footnotePr>
         <w:numRestart w:val="eachSect"/>
       </w:footnotePr>
@@ -363,30 +610,6 @@
     <w:p>
       <w:r>
         <w:separator/>
-      </w:r>
-    </w:p>
-  </w:footnote>
-  <w:footnote w:id="31">
-    <w:p>
-      <w:pPr>
-        <w:pStyle w:val="FootnoteText"/>
-      </w:pPr>
-      <w:r>
-        <w:rPr>
-          <w:rStyle w:val="FootnoteReference"/>
-        </w:rPr>
-        <w:footnoteRef/>
-      </w:r>
-      <w:r>
-        <w:t>Footnote Text.</w:t>
-      </w:r>
-    </w:p>
-    <w:p>
-      <w:pPr>
-        <w:pStyle w:val="FootnoteBlockText"/>
-      </w:pPr>
-      <w:r>
-        <w:t>Footnote Block Text</w:t>
       </w:r>
     </w:p>
   </w:footnote>
@@ -441,17 +664,14 @@
 <file path=word/numbering.xml><?xml version="1.0" encoding="utf-8"?>
 <w:numbering xmlns:w="http://schemas.openxmlformats.org/wordprocessingml/2006/main">
   <w:abstractNum w:abstractNumId="990">
-    <w:nsid w:val="170cd2de"/>
+    <w:nsid w:val="0000A990"/>
     <w:multiLevelType w:val="multilevel"/>
     <w:lvl w:ilvl="0">
       <w:numFmt w:val="bullet"/>
       <w:lvlText w:val=" "/>
       <w:lvlJc w:val="left"/>
       <w:pPr>
-        <w:tabs>
-          <w:tab w:val="num" w:pos="0"/>
-        </w:tabs>
-        <w:ind w:left="480" w:hanging="480"/>
+        <w:ind w:left="720" w:hanging="360"/>
       </w:pPr>
     </w:lvl>
     <w:lvl w:ilvl="1">
@@ -459,10 +679,7 @@
       <w:lvlText w:val=" "/>
       <w:lvlJc w:val="left"/>
       <w:pPr>
-        <w:tabs>
-          <w:tab w:val="num" w:pos="720"/>
-        </w:tabs>
-        <w:ind w:left="1200" w:hanging="480"/>
+        <w:ind w:left="1440" w:hanging="360"/>
       </w:pPr>
     </w:lvl>
     <w:lvl w:ilvl="2">
@@ -470,10 +687,7 @@
       <w:lvlText w:val=" "/>
       <w:lvlJc w:val="left"/>
       <w:pPr>
-        <w:tabs>
-          <w:tab w:val="num" w:pos="1440"/>
-        </w:tabs>
-        <w:ind w:left="1920" w:hanging="480"/>
+        <w:ind w:left="2160" w:hanging="360"/>
       </w:pPr>
     </w:lvl>
     <w:lvl w:ilvl="3">
@@ -481,10 +695,7 @@
       <w:lvlText w:val=" "/>
       <w:lvlJc w:val="left"/>
       <w:pPr>
-        <w:tabs>
-          <w:tab w:val="num" w:pos="2160"/>
-        </w:tabs>
-        <w:ind w:left="2640" w:hanging="480"/>
+        <w:ind w:left="2880" w:hanging="360"/>
       </w:pPr>
     </w:lvl>
     <w:lvl w:ilvl="4">
@@ -492,10 +703,7 @@
       <w:lvlText w:val=" "/>
       <w:lvlJc w:val="left"/>
       <w:pPr>
-        <w:tabs>
-          <w:tab w:val="num" w:pos="2880"/>
-        </w:tabs>
-        <w:ind w:left="3360" w:hanging="480"/>
+        <w:ind w:left="3600" w:hanging="360"/>
       </w:pPr>
     </w:lvl>
     <w:lvl w:ilvl="5">
@@ -503,10 +711,7 @@
       <w:lvlText w:val=" "/>
       <w:lvlJc w:val="left"/>
       <w:pPr>
-        <w:tabs>
-          <w:tab w:val="num" w:pos="3600"/>
-        </w:tabs>
-        <w:ind w:left="4080" w:hanging="480"/>
+        <w:ind w:left="4320" w:hanging="360"/>
       </w:pPr>
     </w:lvl>
     <w:lvl w:ilvl="6">
@@ -514,10 +719,7 @@
       <w:lvlText w:val=" "/>
       <w:lvlJc w:val="left"/>
       <w:pPr>
-        <w:tabs>
-          <w:tab w:val="num" w:pos="4320"/>
-        </w:tabs>
-        <w:ind w:left="4800" w:hanging="480"/>
+        <w:ind w:left="5040" w:hanging="360"/>
       </w:pPr>
     </w:lvl>
     <w:lvl w:ilvl="7">
@@ -525,10 +727,7 @@
       <w:lvlText w:val=" "/>
       <w:lvlJc w:val="left"/>
       <w:pPr>
-        <w:tabs>
-          <w:tab w:val="num" w:pos="5040"/>
-        </w:tabs>
-        <w:ind w:left="5520" w:hanging="480"/>
+        <w:ind w:left="5760" w:hanging="360"/>
       </w:pPr>
     </w:lvl>
     <w:lvl w:ilvl="8">
@@ -536,15 +735,118 @@
       <w:lvlText w:val=" "/>
       <w:lvlJc w:val="left"/>
       <w:pPr>
-        <w:tabs>
-          <w:tab w:val="num" w:pos="5760"/>
-        </w:tabs>
-        <w:ind w:left="6240" w:hanging="480"/>
-      </w:pPr>
+        <w:ind w:left="6480" w:hanging="360"/>
+      </w:pPr>
+    </w:lvl>
+  </w:abstractNum>
+  <w:abstractNum w:abstractNumId="991">
+    <w:nsid w:val="0000A991"/>
+    <w:multiLevelType w:val="multilevel"/>
+    <w:lvl w:ilvl="0">
+      <w:numFmt w:val="bullet"/>
+      <w:lvlText w:val=""/>
+      <w:lvlJc w:val="left"/>
+      <w:pPr>
+        <w:ind w:left="720" w:hanging="360"/>
+      </w:pPr>
+      <w:rPr>
+        <w:rFonts w:ascii="Symbol" w:hAnsi="Symbol" w:cs="Symbol" w:hint="default"/>
+      </w:rPr>
+    </w:lvl>
+    <w:lvl w:ilvl="1">
+      <w:numFmt w:val="bullet"/>
+      <w:lvlText w:val="o"/>
+      <w:lvlJc w:val="left"/>
+      <w:pPr>
+        <w:ind w:left="1440" w:hanging="360"/>
+      </w:pPr>
+      <w:rPr>
+        <w:rFonts w:ascii="Courier New" w:hAnsi="Courier New" w:cs="Courier New" w:hint="default"/>
+      </w:rPr>
+    </w:lvl>
+    <w:lvl w:ilvl="2">
+      <w:numFmt w:val="bullet"/>
+      <w:lvlText w:val=""/>
+      <w:lvlJc w:val="left"/>
+      <w:pPr>
+        <w:ind w:left="2160" w:hanging="360"/>
+      </w:pPr>
+      <w:rPr>
+        <w:rFonts w:ascii="Wingdings" w:hAnsi="Wingdings" w:cs="Wingdings" w:hint="default"/>
+      </w:rPr>
+    </w:lvl>
+    <w:lvl w:ilvl="3">
+      <w:numFmt w:val="bullet"/>
+      <w:lvlText w:val=""/>
+      <w:lvlJc w:val="left"/>
+      <w:pPr>
+        <w:ind w:left="2880" w:hanging="360"/>
+      </w:pPr>
+      <w:rPr>
+        <w:rFonts w:ascii="Symbol" w:hAnsi="Symbol" w:cs="Symbol" w:hint="default"/>
+      </w:rPr>
+    </w:lvl>
+    <w:lvl w:ilvl="4">
+      <w:numFmt w:val="bullet"/>
+      <w:lvlText w:val="o"/>
+      <w:lvlJc w:val="left"/>
+      <w:pPr>
+        <w:ind w:left="3600" w:hanging="360"/>
+      </w:pPr>
+      <w:rPr>
+        <w:rFonts w:ascii="Courier New" w:hAnsi="Courier New" w:cs="Courier New" w:hint="default"/>
+      </w:rPr>
+    </w:lvl>
+    <w:lvl w:ilvl="5">
+      <w:numFmt w:val="bullet"/>
+      <w:lvlText w:val=""/>
+      <w:lvlJc w:val="left"/>
+      <w:pPr>
+        <w:ind w:left="4320" w:hanging="360"/>
+      </w:pPr>
+      <w:rPr>
+        <w:rFonts w:ascii="Wingdings" w:hAnsi="Wingdings" w:cs="Wingdings" w:hint="default"/>
+      </w:rPr>
+    </w:lvl>
+    <w:lvl w:ilvl="6">
+      <w:numFmt w:val="bullet"/>
+      <w:lvlText w:val=""/>
+      <w:lvlJc w:val="left"/>
+      <w:pPr>
+        <w:ind w:left="5040" w:hanging="360"/>
+      </w:pPr>
+      <w:rPr>
+        <w:rFonts w:ascii="Symbol" w:hAnsi="Symbol" w:cs="Symbol" w:hint="default"/>
+      </w:rPr>
+    </w:lvl>
+    <w:lvl w:ilvl="7">
+      <w:numFmt w:val="bullet"/>
+      <w:lvlText w:val="o"/>
+      <w:lvlJc w:val="left"/>
+      <w:pPr>
+        <w:ind w:left="5760" w:hanging="360"/>
+      </w:pPr>
+      <w:rPr>
+        <w:rFonts w:ascii="Courier New" w:hAnsi="Courier New" w:cs="Courier New" w:hint="default"/>
+      </w:rPr>
+    </w:lvl>
+    <w:lvl w:ilvl="8">
+      <w:numFmt w:val="bullet"/>
+      <w:lvlText w:val=""/>
+      <w:lvlJc w:val="left"/>
+      <w:pPr>
+        <w:ind w:left="6480" w:hanging="360"/>
+      </w:pPr>
+      <w:rPr>
+        <w:rFonts w:ascii="Wingdings" w:hAnsi="Wingdings" w:cs="Wingdings" w:hint="default"/>
+      </w:rPr>
     </w:lvl>
   </w:abstractNum>
   <w:num w:numId="1000">
     <w:abstractNumId w:val="990"/>
+  </w:num>
+  <w:num w:numId="1001">
+    <w:abstractNumId w:val="991"/>
   </w:num>
 </w:numbering>
 </file>
@@ -554,10 +856,10 @@
   <w:docDefaults>
     <w:rPrDefault>
       <w:rPr>
-        <w:rFonts w:asciiTheme="minorHAnsi" w:eastAsiaTheme="minorEastAsia" w:hAnsiTheme="minorHAnsi" w:cstheme="minorBidi"/>
+        <w:rFonts w:asciiTheme="minorHAnsi" w:cstheme="minorBidi" w:eastAsiaTheme="minorEastAsia" w:hAnsiTheme="minorHAnsi"/>
         <w:sz w:val="24"/>
         <w:szCs w:val="24"/>
-        <w:lang w:val="en-US" w:eastAsia="zh-CN" w:bidi="ar-SA"/>
+        <w:lang w:bidi="ar-SA" w:eastAsia="zh-CN" w:val="en-US"/>
       </w:rPr>
     </w:rPrDefault>
     <w:pPrDefault>
@@ -566,38 +868,38 @@
       </w:pPr>
     </w:pPrDefault>
   </w:docDefaults>
-  <w:latentStyles w:defLockedState="0" w:defUIPriority="0" w:defSemiHidden="0" w:defUnhideWhenUsed="0" w:defQFormat="0" w:count="276"/>
-  <w:style w:type="paragraph" w:default="1" w:styleId="Normal">
+  <w:latentStyles w:count="276" w:defLockedState="0" w:defQFormat="0" w:defSemiHidden="0" w:defUIPriority="0" w:defUnhideWhenUsed="0"/>
+  <w:style w:default="1" w:styleId="Normal" w:type="paragraph">
     <w:name w:val="Normal"/>
     <w:qFormat/>
     <w:rPr>
-      <w:rFonts w:ascii="Calibri" w:hAnsi="Calibri" w:eastAsia="Calibri" w:cs="Calibri"/>
-    </w:rPr>
-  </w:style>
-  <w:style w:type="paragraph" w:styleId="BodyText">
+      <w:rFonts w:ascii="Calibri" w:cs="Calibri" w:eastAsia="Calibri" w:hAnsi="Calibri"/>
+    </w:rPr>
+  </w:style>
+  <w:style w:styleId="BodyText" w:type="paragraph">
     <w:name w:val="Body Text"/>
     <w:basedOn w:val="Normal"/>
     <w:link w:val="BodyTextChar"/>
     <w:qFormat/>
     <w:pPr>
-      <w:spacing w:before="180" w:after="180"/>
-    </w:pPr>
-  </w:style>
-  <w:style w:type="paragraph" w:customStyle="1" w:styleId="FirstParagraph">
+      <w:spacing w:after="180" w:before="180"/>
+    </w:pPr>
+  </w:style>
+  <w:style w:customStyle="1" w:styleId="FirstParagraph" w:type="paragraph">
     <w:name w:val="First Paragraph"/>
     <w:basedOn w:val="BodyText"/>
     <w:next w:val="BodyText"/>
     <w:qFormat/>
   </w:style>
-  <w:style w:type="paragraph" w:customStyle="1" w:styleId="Compact">
+  <w:style w:customStyle="1" w:styleId="Compact" w:type="paragraph">
     <w:name w:val="Compact"/>
     <w:basedOn w:val="BodyText"/>
     <w:qFormat/>
     <w:pPr>
-      <w:spacing w:before="36" w:after="36"/>
-    </w:pPr>
-  </w:style>
-  <w:style w:type="paragraph" w:styleId="Title">
+      <w:spacing w:after="36" w:before="36"/>
+    </w:pPr>
+  </w:style>
+  <w:style w:styleId="Title" w:type="paragraph">
     <w:name w:val="Title"/>
     <w:basedOn w:val="Normal"/>
     <w:next w:val="BodyText"/>
@@ -611,26 +913,26 @@
       <w:jc w:val="center"/>
     </w:pPr>
     <w:rPr>
-      <w:rFonts w:asciiTheme="majorHAnsi" w:eastAsiaTheme="majorEastAsia" w:hAnsiTheme="majorHAnsi" w:cstheme="majorBidi" w:ascii="Calibri" w:hAnsi="Calibri" w:eastAsia="Calibri" w:cs="Calibri"/>
+      <w:rFonts w:ascii="Calibri" w:asciiTheme="majorHAnsi" w:cs="Calibri" w:cstheme="majorBidi" w:eastAsia="Calibri" w:eastAsiaTheme="majorEastAsia" w:hAnsi="Calibri" w:hAnsiTheme="majorHAnsi"/>
       <w:b/>
       <w:color w:val="A855F7"/>
       <w:sz w:val="56"/>
       <w:szCs w:val="56"/>
     </w:rPr>
   </w:style>
-  <w:style w:type="character" w:customStyle="1" w:styleId="TitleChar">
+  <w:style w:customStyle="1" w:styleId="TitleChar" w:type="character">
     <w:name w:val="Title Char"/>
     <w:basedOn w:val="DefaultParagraphFont"/>
     <w:link w:val="Title"/>
     <w:uiPriority w:val="10"/>
     <w:rsid w:val="00A10FD9"/>
     <w:rPr>
-      <w:rFonts w:asciiTheme="majorHAnsi" w:eastAsiaTheme="majorEastAsia" w:hAnsiTheme="majorHAnsi" w:cstheme="majorBidi"/>
+      <w:rFonts w:asciiTheme="majorHAnsi" w:cstheme="majorBidi" w:eastAsiaTheme="majorEastAsia" w:hAnsiTheme="majorHAnsi"/>
       <w:sz w:val="56"/>
       <w:szCs w:val="56"/>
     </w:rPr>
   </w:style>
-  <w:style w:type="paragraph" w:styleId="Subtitle">
+  <w:style w:styleId="Subtitle" w:type="paragraph">
     <w:name w:val="Subtitle"/>
     <w:basedOn w:val="Title"/>
     <w:next w:val="BodyText"/>
@@ -644,27 +946,27 @@
       </w:numPr>
     </w:pPr>
     <w:rPr>
-      <w:rFonts w:eastAsiaTheme="majorEastAsia" w:cstheme="majorBidi"/>
+      <w:rFonts w:cstheme="majorBidi" w:eastAsiaTheme="majorEastAsia"/>
       <w:spacing w:val="15"/>
       <w:sz w:val="28"/>
       <w:szCs w:val="28"/>
     </w:rPr>
   </w:style>
-  <w:style w:type="character" w:customStyle="1" w:styleId="SubtitleChar">
+  <w:style w:customStyle="1" w:styleId="SubtitleChar" w:type="character">
     <w:name w:val="Subtitle Char"/>
     <w:basedOn w:val="DefaultParagraphFont"/>
     <w:link w:val="Subtitle"/>
     <w:uiPriority w:val="11"/>
     <w:rsid w:val="00A10FD9"/>
     <w:rPr>
-      <w:rFonts w:eastAsiaTheme="majorEastAsia" w:cstheme="majorBidi"/>
-      <w:color w:val="595959" w:themeColor="text1" w:themeTint="A6"/>
+      <w:rFonts w:cstheme="majorBidi" w:eastAsiaTheme="majorEastAsia"/>
+      <w:color w:themeColor="text1" w:themeTint="A6" w:val="595959"/>
       <w:spacing w:val="15"/>
       <w:sz w:val="28"/>
       <w:szCs w:val="28"/>
     </w:rPr>
   </w:style>
-  <w:style w:type="paragraph" w:customStyle="1" w:styleId="Author">
+  <w:style w:customStyle="1" w:styleId="Author" w:type="paragraph">
     <w:name w:val="Author"/>
     <w:basedOn w:val="Title"/>
     <w:next w:val="BodyText"/>
@@ -674,13 +976,13 @@
       <w:keepLines/>
     </w:pPr>
     <w:rPr>
-      <w:rFonts w:ascii="Calibri" w:hAnsi="Calibri" w:eastAsia="Calibri" w:cs="Calibri"/>
+      <w:rFonts w:ascii="Calibri" w:cs="Calibri" w:eastAsia="Calibri" w:hAnsi="Calibri"/>
       <w:color w:val="6B6B6B"/>
       <w:sz w:val="24"/>
       <w:szCs w:val="24"/>
     </w:rPr>
   </w:style>
-  <w:style w:type="paragraph" w:styleId="Date">
+  <w:style w:styleId="Date" w:type="paragraph">
     <w:name w:val="Date"/>
     <w:basedOn w:val="Title"/>
     <w:next w:val="BodyText"/>
@@ -690,13 +992,13 @@
       <w:keepLines/>
     </w:pPr>
     <w:rPr>
-      <w:rFonts w:ascii="Calibri" w:hAnsi="Calibri" w:eastAsia="Calibri" w:cs="Calibri"/>
+      <w:rFonts w:ascii="Calibri" w:cs="Calibri" w:eastAsia="Calibri" w:hAnsi="Calibri"/>
       <w:color w:val="6B6B6B"/>
       <w:sz w:val="24"/>
       <w:szCs w:val="24"/>
     </w:rPr>
   </w:style>
-  <w:style w:type="paragraph" w:customStyle="1" w:styleId="AbstractTitle">
+  <w:style w:customStyle="1" w:styleId="AbstractTitle" w:type="paragraph">
     <w:name w:val="Abstract Title"/>
     <w:basedOn w:val="Normal"/>
     <w:next w:val="Abstract"/>
@@ -704,7 +1006,7 @@
     <w:pPr>
       <w:keepNext/>
       <w:keepLines/>
-      <w:spacing w:before="300" w:after="0"/>
+      <w:spacing w:after="0" w:before="300"/>
       <w:jc w:val="center"/>
     </w:pPr>
     <w:rPr>
@@ -713,7 +1015,7 @@
       <w:szCs w:val="20"/>
     </w:rPr>
   </w:style>
-  <w:style w:type="paragraph" w:customStyle="1" w:styleId="Abstract">
+  <w:style w:customStyle="1" w:styleId="Abstract" w:type="paragraph">
     <w:name w:val="Abstract"/>
     <w:basedOn w:val="Normal"/>
     <w:next w:val="BodyText"/>
@@ -721,14 +1023,14 @@
     <w:pPr>
       <w:keepNext/>
       <w:keepLines/>
-      <w:spacing w:before="100" w:after="300"/>
+      <w:spacing w:after="300" w:before="100"/>
     </w:pPr>
     <w:rPr>
       <w:sz w:val="20"/>
       <w:szCs w:val="20"/>
     </w:rPr>
   </w:style>
-  <w:style w:type="paragraph" w:styleId="Bibliography">
+  <w:style w:styleId="Bibliography" w:type="paragraph">
     <w:name w:val="Bibliography"/>
     <w:basedOn w:val="Normal"/>
     <w:next w:val="Bibliography"/>
@@ -736,7 +1038,7 @@
     <w:pPr/>
     <w:rPr/>
   </w:style>
-  <w:style w:type="paragraph" w:styleId="Heading1">
+  <w:style w:styleId="Heading1" w:type="paragraph">
     <w:name w:val="heading 1"/>
     <w:basedOn w:val="Normal"/>
     <w:next w:val="BodyText"/>
@@ -747,18 +1049,18 @@
     <w:pPr>
       <w:keepNext/>
       <w:keepLines/>
-      <w:spacing w:before="360" w:after="80"/>
+      <w:spacing w:after="80" w:before="360"/>
       <w:outlineLvl w:val="0"/>
     </w:pPr>
     <w:rPr>
-      <w:rFonts w:asciiTheme="majorHAnsi" w:eastAsiaTheme="majorEastAsia" w:hAnsiTheme="majorHAnsi" w:cstheme="majorBidi" w:ascii="Calibri" w:hAnsi="Calibri" w:eastAsia="Calibri" w:cs="Calibri"/>
+      <w:rFonts w:ascii="Calibri" w:asciiTheme="majorHAnsi" w:cs="Calibri" w:cstheme="majorBidi" w:eastAsia="Calibri" w:eastAsiaTheme="majorEastAsia" w:hAnsi="Calibri" w:hAnsiTheme="majorHAnsi"/>
       <w:b/>
       <w:color w:val="A855F7"/>
       <w:sz w:val="36"/>
       <w:szCs w:val="40"/>
     </w:rPr>
   </w:style>
-  <w:style w:type="paragraph" w:styleId="Heading2">
+  <w:style w:styleId="Heading2" w:type="paragraph">
     <w:name w:val="heading 2"/>
     <w:basedOn w:val="Normal"/>
     <w:next w:val="BodyText"/>
@@ -771,18 +1073,18 @@
     <w:pPr>
       <w:keepNext/>
       <w:keepLines/>
-      <w:spacing w:before="160" w:after="80"/>
+      <w:spacing w:after="80" w:before="160"/>
       <w:outlineLvl w:val="1"/>
     </w:pPr>
     <w:rPr>
-      <w:rFonts w:asciiTheme="majorHAnsi" w:eastAsiaTheme="majorEastAsia" w:hAnsiTheme="majorHAnsi" w:cstheme="majorBidi" w:ascii="Calibri" w:hAnsi="Calibri" w:eastAsia="Calibri" w:cs="Calibri"/>
+      <w:rFonts w:ascii="Calibri" w:asciiTheme="majorHAnsi" w:cs="Calibri" w:cstheme="majorBidi" w:eastAsia="Calibri" w:eastAsiaTheme="majorEastAsia" w:hAnsi="Calibri" w:hAnsiTheme="majorHAnsi"/>
       <w:b/>
       <w:color w:val="A855F7"/>
       <w:sz w:val="28"/>
       <w:szCs w:val="32"/>
     </w:rPr>
   </w:style>
-  <w:style w:type="paragraph" w:styleId="Heading3">
+  <w:style w:styleId="Heading3" w:type="paragraph">
     <w:name w:val="heading 3"/>
     <w:basedOn w:val="Normal"/>
     <w:next w:val="BodyText"/>
@@ -795,18 +1097,18 @@
     <w:pPr>
       <w:keepNext/>
       <w:keepLines/>
-      <w:spacing w:before="160" w:after="80"/>
+      <w:spacing w:after="80" w:before="160"/>
       <w:outlineLvl w:val="2"/>
     </w:pPr>
     <w:rPr>
-      <w:rFonts w:eastAsiaTheme="majorEastAsia" w:cstheme="majorBidi" w:ascii="Calibri" w:hAnsi="Calibri" w:eastAsia="Calibri" w:cs="Calibri"/>
+      <w:rFonts w:ascii="Calibri" w:cs="Calibri" w:cstheme="majorBidi" w:eastAsia="Calibri" w:eastAsiaTheme="majorEastAsia" w:hAnsi="Calibri"/>
       <w:b/>
       <w:color w:val="A855F7"/>
       <w:sz w:val="24"/>
       <w:szCs w:val="28"/>
     </w:rPr>
   </w:style>
-  <w:style w:type="paragraph" w:styleId="Heading4">
+  <w:style w:styleId="Heading4" w:type="paragraph">
     <w:name w:val="heading 4"/>
     <w:basedOn w:val="Normal"/>
     <w:next w:val="BodyText"/>
@@ -819,17 +1121,17 @@
     <w:pPr>
       <w:keepNext/>
       <w:keepLines/>
-      <w:spacing w:before="80" w:after="40"/>
+      <w:spacing w:after="40" w:before="80"/>
       <w:outlineLvl w:val="3"/>
     </w:pPr>
     <w:rPr>
-      <w:rFonts w:eastAsiaTheme="majorEastAsia" w:cstheme="majorBidi"/>
+      <w:rFonts w:cstheme="majorBidi" w:eastAsiaTheme="majorEastAsia"/>
       <w:i/>
       <w:iCs/>
-      <w:color w:val="0F4761" w:themeColor="accent1" w:themeShade="BF"/>
-    </w:rPr>
-  </w:style>
-  <w:style w:type="paragraph" w:styleId="Heading5">
+      <w:color w:themeColor="accent1" w:themeShade="BF" w:val="0F4761"/>
+    </w:rPr>
+  </w:style>
+  <w:style w:styleId="Heading5" w:type="paragraph">
     <w:name w:val="heading 5"/>
     <w:basedOn w:val="Normal"/>
     <w:next w:val="BodyText"/>
@@ -842,15 +1144,15 @@
     <w:pPr>
       <w:keepNext/>
       <w:keepLines/>
-      <w:spacing w:before="80" w:after="40"/>
+      <w:spacing w:after="40" w:before="80"/>
       <w:outlineLvl w:val="4"/>
     </w:pPr>
     <w:rPr>
-      <w:rFonts w:eastAsiaTheme="majorEastAsia" w:cstheme="majorBidi"/>
-      <w:color w:val="0F4761" w:themeColor="accent1" w:themeShade="BF"/>
-    </w:rPr>
-  </w:style>
-  <w:style w:type="paragraph" w:styleId="Heading6">
+      <w:rFonts w:cstheme="majorBidi" w:eastAsiaTheme="majorEastAsia"/>
+      <w:color w:themeColor="accent1" w:themeShade="BF" w:val="0F4761"/>
+    </w:rPr>
+  </w:style>
+  <w:style w:styleId="Heading6" w:type="paragraph">
     <w:name w:val="heading 6"/>
     <w:basedOn w:val="Normal"/>
     <w:next w:val="BodyText"/>
@@ -863,17 +1165,17 @@
     <w:pPr>
       <w:keepNext/>
       <w:keepLines/>
-      <w:spacing w:before="40" w:after="0"/>
+      <w:spacing w:after="0" w:before="40"/>
       <w:outlineLvl w:val="5"/>
     </w:pPr>
     <w:rPr>
-      <w:rFonts w:eastAsiaTheme="majorEastAsia" w:cstheme="majorBidi"/>
+      <w:rFonts w:cstheme="majorBidi" w:eastAsiaTheme="majorEastAsia"/>
       <w:i/>
       <w:iCs/>
-      <w:color w:val="595959" w:themeColor="text1" w:themeTint="A6"/>
-    </w:rPr>
-  </w:style>
-  <w:style w:type="paragraph" w:styleId="Heading7">
+      <w:color w:themeColor="text1" w:themeTint="A6" w:val="595959"/>
+    </w:rPr>
+  </w:style>
+  <w:style w:styleId="Heading7" w:type="paragraph">
     <w:name w:val="heading 7"/>
     <w:basedOn w:val="Normal"/>
     <w:next w:val="BodyText"/>
@@ -886,15 +1188,15 @@
     <w:pPr>
       <w:keepNext/>
       <w:keepLines/>
-      <w:spacing w:before="40" w:after="0"/>
+      <w:spacing w:after="0" w:before="40"/>
       <w:outlineLvl w:val="6"/>
     </w:pPr>
     <w:rPr>
-      <w:rFonts w:eastAsiaTheme="majorEastAsia" w:cstheme="majorBidi"/>
-      <w:color w:val="595959" w:themeColor="text1" w:themeTint="A6"/>
-    </w:rPr>
-  </w:style>
-  <w:style w:type="paragraph" w:styleId="Heading8">
+      <w:rFonts w:cstheme="majorBidi" w:eastAsiaTheme="majorEastAsia"/>
+      <w:color w:themeColor="text1" w:themeTint="A6" w:val="595959"/>
+    </w:rPr>
+  </w:style>
+  <w:style w:styleId="Heading8" w:type="paragraph">
     <w:name w:val="heading 8"/>
     <w:basedOn w:val="Normal"/>
     <w:next w:val="BodyText"/>
@@ -911,13 +1213,13 @@
       <w:outlineLvl w:val="7"/>
     </w:pPr>
     <w:rPr>
-      <w:rFonts w:eastAsiaTheme="majorEastAsia" w:cstheme="majorBidi"/>
+      <w:rFonts w:cstheme="majorBidi" w:eastAsiaTheme="majorEastAsia"/>
       <w:i/>
       <w:iCs/>
-      <w:color w:val="272727" w:themeColor="text1" w:themeTint="D8"/>
-    </w:rPr>
-  </w:style>
-  <w:style w:type="paragraph" w:styleId="Heading9">
+      <w:color w:themeColor="text1" w:themeTint="D8" w:val="272727"/>
+    </w:rPr>
+  </w:style>
+  <w:style w:styleId="Heading9" w:type="paragraph">
     <w:name w:val="heading 9"/>
     <w:basedOn w:val="Normal"/>
     <w:next w:val="BodyText"/>
@@ -934,24 +1236,24 @@
       <w:outlineLvl w:val="8"/>
     </w:pPr>
     <w:rPr>
-      <w:rFonts w:eastAsiaTheme="majorEastAsia" w:cstheme="majorBidi"/>
-      <w:color w:val="272727" w:themeColor="text1" w:themeTint="D8"/>
-    </w:rPr>
-  </w:style>
-  <w:style w:type="character" w:customStyle="1" w:styleId="Heading1Char">
+      <w:rFonts w:cstheme="majorBidi" w:eastAsiaTheme="majorEastAsia"/>
+      <w:color w:themeColor="text1" w:themeTint="D8" w:val="272727"/>
+    </w:rPr>
+  </w:style>
+  <w:style w:customStyle="1" w:styleId="Heading1Char" w:type="character">
     <w:name w:val="Heading 1 Char"/>
     <w:basedOn w:val="DefaultParagraphFont"/>
     <w:link w:val="Heading1"/>
     <w:uiPriority w:val="9"/>
     <w:rsid w:val="00A10FD9"/>
     <w:rPr>
-      <w:rFonts w:asciiTheme="majorHAnsi" w:eastAsiaTheme="majorEastAsia" w:hAnsiTheme="majorHAnsi" w:cstheme="majorBidi"/>
-      <w:color w:val="0F4761" w:themeColor="accent1" w:themeShade="BF"/>
+      <w:rFonts w:asciiTheme="majorHAnsi" w:cstheme="majorBidi" w:eastAsiaTheme="majorEastAsia" w:hAnsiTheme="majorHAnsi"/>
+      <w:color w:themeColor="accent1" w:themeShade="BF" w:val="0F4761"/>
       <w:sz w:val="40"/>
       <w:szCs w:val="40"/>
     </w:rPr>
   </w:style>
-  <w:style w:type="character" w:customStyle="1" w:styleId="Heading2Char">
+  <w:style w:customStyle="1" w:styleId="Heading2Char" w:type="character">
     <w:name w:val="Heading 2 Char"/>
     <w:basedOn w:val="DefaultParagraphFont"/>
     <w:link w:val="Heading2"/>
@@ -959,13 +1261,13 @@
     <w:semiHidden/>
     <w:rsid w:val="00A10FD9"/>
     <w:rPr>
-      <w:rFonts w:asciiTheme="majorHAnsi" w:eastAsiaTheme="majorEastAsia" w:hAnsiTheme="majorHAnsi" w:cstheme="majorBidi"/>
-      <w:color w:val="0F4761" w:themeColor="accent1" w:themeShade="BF"/>
+      <w:rFonts w:asciiTheme="majorHAnsi" w:cstheme="majorBidi" w:eastAsiaTheme="majorEastAsia" w:hAnsiTheme="majorHAnsi"/>
+      <w:color w:themeColor="accent1" w:themeShade="BF" w:val="0F4761"/>
       <w:sz w:val="32"/>
       <w:szCs w:val="32"/>
     </w:rPr>
   </w:style>
-  <w:style w:type="character" w:customStyle="1" w:styleId="Heading3Char">
+  <w:style w:customStyle="1" w:styleId="Heading3Char" w:type="character">
     <w:name w:val="Heading 3 Char"/>
     <w:basedOn w:val="DefaultParagraphFont"/>
     <w:link w:val="Heading3"/>
@@ -973,13 +1275,13 @@
     <w:semiHidden/>
     <w:rsid w:val="00A10FD9"/>
     <w:rPr>
-      <w:rFonts w:eastAsiaTheme="majorEastAsia" w:cstheme="majorBidi"/>
-      <w:color w:val="0F4761" w:themeColor="accent1" w:themeShade="BF"/>
+      <w:rFonts w:cstheme="majorBidi" w:eastAsiaTheme="majorEastAsia"/>
+      <w:color w:themeColor="accent1" w:themeShade="BF" w:val="0F4761"/>
       <w:sz w:val="28"/>
       <w:szCs w:val="28"/>
     </w:rPr>
   </w:style>
-  <w:style w:type="character" w:customStyle="1" w:styleId="Heading4Char">
+  <w:style w:customStyle="1" w:styleId="Heading4Char" w:type="character">
     <w:name w:val="Heading 4 Char"/>
     <w:basedOn w:val="DefaultParagraphFont"/>
     <w:link w:val="Heading4"/>
@@ -987,13 +1289,13 @@
     <w:semiHidden/>
     <w:rsid w:val="00A10FD9"/>
     <w:rPr>
-      <w:rFonts w:eastAsiaTheme="majorEastAsia" w:cstheme="majorBidi"/>
+      <w:rFonts w:cstheme="majorBidi" w:eastAsiaTheme="majorEastAsia"/>
       <w:i/>
       <w:iCs/>
-      <w:color w:val="0F4761" w:themeColor="accent1" w:themeShade="BF"/>
-    </w:rPr>
-  </w:style>
-  <w:style w:type="character" w:customStyle="1" w:styleId="Heading5Char">
+      <w:color w:themeColor="accent1" w:themeShade="BF" w:val="0F4761"/>
+    </w:rPr>
+  </w:style>
+  <w:style w:customStyle="1" w:styleId="Heading5Char" w:type="character">
     <w:name w:val="Heading 5 Char"/>
     <w:basedOn w:val="DefaultParagraphFont"/>
     <w:link w:val="Heading5"/>
@@ -1001,11 +1303,11 @@
     <w:semiHidden/>
     <w:rsid w:val="00A10FD9"/>
     <w:rPr>
-      <w:rFonts w:eastAsiaTheme="majorEastAsia" w:cstheme="majorBidi"/>
-      <w:color w:val="0F4761" w:themeColor="accent1" w:themeShade="BF"/>
-    </w:rPr>
-  </w:style>
-  <w:style w:type="character" w:customStyle="1" w:styleId="Heading6Char">
+      <w:rFonts w:cstheme="majorBidi" w:eastAsiaTheme="majorEastAsia"/>
+      <w:color w:themeColor="accent1" w:themeShade="BF" w:val="0F4761"/>
+    </w:rPr>
+  </w:style>
+  <w:style w:customStyle="1" w:styleId="Heading6Char" w:type="character">
     <w:name w:val="Heading 6 Char"/>
     <w:basedOn w:val="DefaultParagraphFont"/>
     <w:link w:val="Heading6"/>
@@ -1013,13 +1315,13 @@
     <w:semiHidden/>
     <w:rsid w:val="00A10FD9"/>
     <w:rPr>
-      <w:rFonts w:eastAsiaTheme="majorEastAsia" w:cstheme="majorBidi"/>
+      <w:rFonts w:cstheme="majorBidi" w:eastAsiaTheme="majorEastAsia"/>
       <w:i/>
       <w:iCs/>
-      <w:color w:val="595959" w:themeColor="text1" w:themeTint="A6"/>
-    </w:rPr>
-  </w:style>
-  <w:style w:type="character" w:customStyle="1" w:styleId="Heading7Char">
+      <w:color w:themeColor="text1" w:themeTint="A6" w:val="595959"/>
+    </w:rPr>
+  </w:style>
+  <w:style w:customStyle="1" w:styleId="Heading7Char" w:type="character">
     <w:name w:val="Heading 7 Char"/>
     <w:basedOn w:val="DefaultParagraphFont"/>
     <w:link w:val="Heading7"/>
@@ -1027,11 +1329,11 @@
     <w:semiHidden/>
     <w:rsid w:val="00A10FD9"/>
     <w:rPr>
-      <w:rFonts w:eastAsiaTheme="majorEastAsia" w:cstheme="majorBidi"/>
-      <w:color w:val="595959" w:themeColor="text1" w:themeTint="A6"/>
-    </w:rPr>
-  </w:style>
-  <w:style w:type="character" w:customStyle="1" w:styleId="Heading8Char">
+      <w:rFonts w:cstheme="majorBidi" w:eastAsiaTheme="majorEastAsia"/>
+      <w:color w:themeColor="text1" w:themeTint="A6" w:val="595959"/>
+    </w:rPr>
+  </w:style>
+  <w:style w:customStyle="1" w:styleId="Heading8Char" w:type="character">
     <w:name w:val="Heading 8 Char"/>
     <w:basedOn w:val="DefaultParagraphFont"/>
     <w:link w:val="Heading8"/>
@@ -1039,13 +1341,13 @@
     <w:semiHidden/>
     <w:rsid w:val="00A10FD9"/>
     <w:rPr>
-      <w:rFonts w:eastAsiaTheme="majorEastAsia" w:cstheme="majorBidi"/>
+      <w:rFonts w:cstheme="majorBidi" w:eastAsiaTheme="majorEastAsia"/>
       <w:i/>
       <w:iCs/>
-      <w:color w:val="272727" w:themeColor="text1" w:themeTint="D8"/>
-    </w:rPr>
-  </w:style>
-  <w:style w:type="character" w:customStyle="1" w:styleId="Heading9Char">
+      <w:color w:themeColor="text1" w:themeTint="D8" w:val="272727"/>
+    </w:rPr>
+  </w:style>
+  <w:style w:customStyle="1" w:styleId="Heading9Char" w:type="character">
     <w:name w:val="Heading 9 Char"/>
     <w:basedOn w:val="DefaultParagraphFont"/>
     <w:link w:val="Heading9"/>
@@ -1053,11 +1355,11 @@
     <w:semiHidden/>
     <w:rsid w:val="00A10FD9"/>
     <w:rPr>
-      <w:rFonts w:eastAsiaTheme="majorEastAsia" w:cstheme="majorBidi"/>
-      <w:color w:val="272727" w:themeColor="text1" w:themeTint="D8"/>
-    </w:rPr>
-  </w:style>
-  <w:style w:type="paragraph" w:styleId="BlockText">
+      <w:rFonts w:cstheme="majorBidi" w:eastAsiaTheme="majorEastAsia"/>
+      <w:color w:themeColor="text1" w:themeTint="D8" w:val="272727"/>
+    </w:rPr>
+  </w:style>
+  <w:style w:styleId="BlockText" w:type="paragraph">
     <w:name w:val="Block Text"/>
     <w:basedOn w:val="BodyText"/>
     <w:next w:val="BodyText"/>
@@ -1065,11 +1367,11 @@
     <w:unhideWhenUsed/>
     <w:qFormat/>
     <w:pPr>
-      <w:spacing w:before="100" w:after="100"/>
+      <w:spacing w:after="100" w:before="100"/>
       <w:ind w:firstLine="0" w:left="480" w:right="480"/>
     </w:pPr>
   </w:style>
-  <w:style w:type="paragraph" w:styleId="FootnoteText">
+  <w:style w:styleId="FootnoteText" w:type="paragraph">
     <w:name w:val="Footnote Text"/>
     <w:basedOn w:val="Normal"/>
     <w:next w:val="FootnoteText"/>
@@ -1077,7 +1379,7 @@
     <w:unhideWhenUsed/>
     <w:qFormat/>
   </w:style>
-  <w:style w:type="paragraph" w:styleId="FootnoteBlockText">
+  <w:style w:styleId="FootnoteBlockText" w:type="paragraph">
     <w:name w:val="Footnote Block Text"/>
     <w:basedOn w:val="FootnoteText"/>
     <w:next w:val="FootnoteText"/>
@@ -1085,28 +1387,28 @@
     <w:unhideWhenUsed/>
     <w:qFormat/>
     <w:pPr>
-      <w:spacing w:before="100" w:after="100"/>
+      <w:spacing w:after="100" w:before="100"/>
       <w:ind w:firstLine="0" w:left="480" w:right="480"/>
     </w:pPr>
   </w:style>
-  <w:style w:type="character" w:default="1" w:styleId="DefaultParagraphFont">
+  <w:style w:default="1" w:styleId="DefaultParagraphFont" w:type="character">
     <w:name w:val="Default Paragraph Font"/>
     <w:semiHidden/>
     <w:unhideWhenUsed/>
   </w:style>
-  <w:style w:type="table" w:default="1" w:styleId="Table">
+  <w:style w:default="1" w:styleId="Table" w:type="table">
     <w:name w:val="Table"/>
     <w:basedOn w:val="TableNormal"/>
     <w:semiHidden/>
     <w:unhideWhenUsed/>
     <w:qFormat/>
     <w:tblPr>
-      <w:tblInd w:w="0" w:type="dxa"/>
+      <w:tblInd w:type="dxa" w:w="0"/>
       <w:tblCellMar>
-        <w:top w:w="0" w:type="dxa"/>
-        <w:left w:w="108" w:type="dxa"/>
-        <w:bottom w:w="0" w:type="dxa"/>
-        <w:right w:w="108" w:type="dxa"/>
+        <w:top w:type="dxa" w:w="0"/>
+        <w:left w:type="dxa" w:w="108"/>
+        <w:bottom w:type="dxa" w:w="0"/>
+        <w:right w:type="dxa" w:w="108"/>
       </w:tblCellMar>
     </w:tblPr>
     <w:tblStylePr w:type="firstRow">
@@ -1118,7 +1420,7 @@
       </w:tcPr>
     </w:tblStylePr>
   </w:style>
-  <w:style w:type="paragraph" w:customStyle="1" w:styleId="DefinitionTerm">
+  <w:style w:customStyle="1" w:styleId="DefinitionTerm" w:type="paragraph">
     <w:name w:val="Definition Term"/>
     <w:basedOn w:val="Normal"/>
     <w:next w:val="Definition"/>
@@ -1131,49 +1433,49 @@
       <w:b/>
     </w:rPr>
   </w:style>
-  <w:style w:type="paragraph" w:customStyle="1" w:styleId="Definition">
+  <w:style w:customStyle="1" w:styleId="Definition" w:type="paragraph">
     <w:name w:val="Definition"/>
     <w:basedOn w:val="Normal"/>
   </w:style>
-  <w:style w:type="paragraph" w:styleId="Caption">
+  <w:style w:styleId="Caption" w:type="paragraph">
     <w:name w:val="Caption"/>
     <w:basedOn w:val="Normal"/>
     <w:link w:val="BodyTextChar"/>
     <w:pPr>
-      <w:spacing w:before="0" w:after="120"/>
+      <w:spacing w:after="120" w:before="0"/>
     </w:pPr>
     <w:rPr>
       <w:i/>
     </w:rPr>
   </w:style>
-  <w:style w:type="paragraph" w:customStyle="1" w:styleId="TableCaption">
+  <w:style w:customStyle="1" w:styleId="TableCaption" w:type="paragraph">
     <w:name w:val="Table Caption"/>
     <w:basedOn w:val="Caption"/>
     <w:pPr>
       <w:keepNext/>
     </w:pPr>
   </w:style>
-  <w:style w:type="paragraph" w:customStyle="1" w:styleId="ImageCaption">
+  <w:style w:customStyle="1" w:styleId="ImageCaption" w:type="paragraph">
     <w:name w:val="Image Caption"/>
     <w:basedOn w:val="Caption"/>
   </w:style>
-  <w:style w:type="paragraph" w:customStyle="1" w:styleId="Figure">
+  <w:style w:customStyle="1" w:styleId="Figure" w:type="paragraph">
     <w:name w:val="Figure"/>
     <w:basedOn w:val="Normal"/>
   </w:style>
-  <w:style w:type="paragraph" w:customStyle="1" w:styleId="CaptionedFigure">
+  <w:style w:customStyle="1" w:styleId="CaptionedFigure" w:type="paragraph">
     <w:name w:val="Captioned Figure"/>
     <w:basedOn w:val="Figure"/>
     <w:pPr>
       <w:keepNext/>
     </w:pPr>
   </w:style>
-  <w:style w:type="character" w:customStyle="1" w:styleId="BodyTextChar">
+  <w:style w:customStyle="1" w:styleId="BodyTextChar" w:type="character">
     <w:name w:val="Body Text Char"/>
     <w:basedOn w:val="DefaultParagraphFont"/>
     <w:link w:val="BodyText"/>
   </w:style>
-  <w:style w:type="character" w:customStyle="1" w:styleId="VerbatimChar">
+  <w:style w:customStyle="1" w:styleId="VerbatimChar" w:type="character">
     <w:name w:val="Verbatim Char"/>
     <w:basedOn w:val="BodyTextChar"/>
     <w:rPr>
@@ -1181,25 +1483,25 @@
       <w:sz w:val="22"/>
     </w:rPr>
   </w:style>
-  <w:style w:type="character" w:customStyle="1" w:styleId="SectionNumber">
+  <w:style w:customStyle="1" w:styleId="SectionNumber" w:type="character">
     <w:name w:val="Section Number"/>
     <w:basedOn w:val="BodyTextChar"/>
   </w:style>
-  <w:style w:type="character" w:styleId="FootnoteReference">
+  <w:style w:styleId="FootnoteReference" w:type="character">
     <w:name w:val="Footnote Reference"/>
     <w:basedOn w:val="BodyTextChar"/>
     <w:rPr>
       <w:vertAlign w:val="superscript"/>
     </w:rPr>
   </w:style>
-  <w:style w:type="character" w:styleId="Hyperlink">
+  <w:style w:styleId="Hyperlink" w:type="character">
     <w:name w:val="Hyperlink"/>
     <w:basedOn w:val="BodyTextChar"/>
     <w:rPr>
-      <w:color w:val="4F81BD" w:themeColor="accent1"/>
-    </w:rPr>
-  </w:style>
-  <w:style w:type="paragraph" w:styleId="TOCHeading">
+      <w:color w:themeColor="accent1" w:val="4F81BD"/>
+    </w:rPr>
+  </w:style>
+  <w:style w:styleId="TOCHeading" w:type="paragraph">
     <w:name w:val="TOC Heading"/>
     <w:basedOn w:val="Heading1"/>
     <w:next w:val="BodyText"/>
@@ -1212,12 +1514,246 @@
       <w:outlineLvl w:val="9"/>
     </w:pPr>
     <w:rPr>
-      <w:rFonts w:asciiTheme="majorHAnsi" w:eastAsiaTheme="majorEastAsia" w:hAnsiTheme="majorHAnsi" w:cstheme="majorBidi" w:ascii="Calibri" w:hAnsi="Calibri" w:eastAsia="Calibri" w:cs="Calibri"/>
+      <w:rFonts w:ascii="Calibri" w:asciiTheme="majorHAnsi" w:cs="Calibri" w:cstheme="majorBidi" w:eastAsia="Calibri" w:eastAsiaTheme="majorEastAsia" w:hAnsi="Calibri" w:hAnsiTheme="majorHAnsi"/>
       <w:b/>
       <w:bCs w:val="0"/>
       <w:color w:val="A855F7"/>
       <w:sz w:val="36"/>
     </w:rPr>
+  </w:style>
+  <w:style w:type="paragraph" w:customStyle="1" w:styleId="SourceCode">
+    <w:name w:val="Source Code"/>
+    <w:basedOn w:val="Normal"/>
+    <w:link w:val="VerbatimChar"/>
+    <w:pPr>
+      <w:wordWrap w:val="off"/>
+    </w:pPr>
+  </w:style>
+  <w:style w:type="character" w:customStyle="1" w:styleId="KeywordTok">
+    <w:name w:val="KeywordTok"/>
+    <w:basedOn w:val="VerbatimChar"/>
+    <w:rPr>
+      <w:b/>
+      <w:color w:val="007020"/>
+    </w:rPr>
+  </w:style>
+  <w:style w:type="character" w:customStyle="1" w:styleId="DataTypeTok">
+    <w:name w:val="DataTypeTok"/>
+    <w:basedOn w:val="VerbatimChar"/>
+    <w:rPr>
+      <w:color w:val="902000"/>
+    </w:rPr>
+  </w:style>
+  <w:style w:type="character" w:customStyle="1" w:styleId="DecValTok">
+    <w:name w:val="DecValTok"/>
+    <w:basedOn w:val="VerbatimChar"/>
+    <w:rPr>
+      <w:color w:val="40a070"/>
+    </w:rPr>
+  </w:style>
+  <w:style w:type="character" w:customStyle="1" w:styleId="BaseNTok">
+    <w:name w:val="BaseNTok"/>
+    <w:basedOn w:val="VerbatimChar"/>
+    <w:rPr>
+      <w:color w:val="40a070"/>
+    </w:rPr>
+  </w:style>
+  <w:style w:type="character" w:customStyle="1" w:styleId="FloatTok">
+    <w:name w:val="FloatTok"/>
+    <w:basedOn w:val="VerbatimChar"/>
+    <w:rPr>
+      <w:color w:val="40a070"/>
+    </w:rPr>
+  </w:style>
+  <w:style w:type="character" w:customStyle="1" w:styleId="ConstantTok">
+    <w:name w:val="ConstantTok"/>
+    <w:basedOn w:val="VerbatimChar"/>
+    <w:rPr>
+      <w:color w:val="880000"/>
+    </w:rPr>
+  </w:style>
+  <w:style w:type="character" w:customStyle="1" w:styleId="CharTok">
+    <w:name w:val="CharTok"/>
+    <w:basedOn w:val="VerbatimChar"/>
+    <w:rPr>
+      <w:color w:val="4070a0"/>
+    </w:rPr>
+  </w:style>
+  <w:style w:type="character" w:customStyle="1" w:styleId="SpecialCharTok">
+    <w:name w:val="SpecialCharTok"/>
+    <w:basedOn w:val="VerbatimChar"/>
+    <w:rPr>
+      <w:color w:val="4070a0"/>
+    </w:rPr>
+  </w:style>
+  <w:style w:type="character" w:customStyle="1" w:styleId="StringTok">
+    <w:name w:val="StringTok"/>
+    <w:basedOn w:val="VerbatimChar"/>
+    <w:rPr>
+      <w:color w:val="4070a0"/>
+    </w:rPr>
+  </w:style>
+  <w:style w:type="character" w:customStyle="1" w:styleId="VerbatimStringTok">
+    <w:name w:val="VerbatimStringTok"/>
+    <w:basedOn w:val="VerbatimChar"/>
+    <w:rPr>
+      <w:color w:val="4070a0"/>
+    </w:rPr>
+  </w:style>
+  <w:style w:type="character" w:customStyle="1" w:styleId="SpecialStringTok">
+    <w:name w:val="SpecialStringTok"/>
+    <w:basedOn w:val="VerbatimChar"/>
+    <w:rPr>
+      <w:color w:val="bb6688"/>
+    </w:rPr>
+  </w:style>
+  <w:style w:type="character" w:customStyle="1" w:styleId="ImportTok">
+    <w:name w:val="ImportTok"/>
+    <w:basedOn w:val="VerbatimChar"/>
+    <w:rPr>
+      <w:b/>
+      <w:color w:val="008000"/>
+    </w:rPr>
+  </w:style>
+  <w:style w:type="character" w:customStyle="1" w:styleId="CommentTok">
+    <w:name w:val="CommentTok"/>
+    <w:basedOn w:val="VerbatimChar"/>
+    <w:rPr>
+      <w:i/>
+      <w:color w:val="60a0b0"/>
+    </w:rPr>
+  </w:style>
+  <w:style w:type="character" w:customStyle="1" w:styleId="DocumentationTok">
+    <w:name w:val="DocumentationTok"/>
+    <w:basedOn w:val="VerbatimChar"/>
+    <w:rPr>
+      <w:i/>
+      <w:color w:val="ba2121"/>
+    </w:rPr>
+  </w:style>
+  <w:style w:type="character" w:customStyle="1" w:styleId="AnnotationTok">
+    <w:name w:val="AnnotationTok"/>
+    <w:basedOn w:val="VerbatimChar"/>
+    <w:rPr>
+      <w:b/>
+      <w:i/>
+      <w:color w:val="60a0b0"/>
+    </w:rPr>
+  </w:style>
+  <w:style w:type="character" w:customStyle="1" w:styleId="CommentVarTok">
+    <w:name w:val="CommentVarTok"/>
+    <w:basedOn w:val="VerbatimChar"/>
+    <w:rPr>
+      <w:b/>
+      <w:i/>
+      <w:color w:val="60a0b0"/>
+    </w:rPr>
+  </w:style>
+  <w:style w:type="character" w:customStyle="1" w:styleId="OtherTok">
+    <w:name w:val="OtherTok"/>
+    <w:basedOn w:val="VerbatimChar"/>
+    <w:rPr>
+      <w:color w:val="007020"/>
+    </w:rPr>
+  </w:style>
+  <w:style w:type="character" w:customStyle="1" w:styleId="FunctionTok">
+    <w:name w:val="FunctionTok"/>
+    <w:basedOn w:val="VerbatimChar"/>
+    <w:rPr>
+      <w:color w:val="06287e"/>
+    </w:rPr>
+  </w:style>
+  <w:style w:type="character" w:customStyle="1" w:styleId="VariableTok">
+    <w:name w:val="VariableTok"/>
+    <w:basedOn w:val="VerbatimChar"/>
+    <w:rPr>
+      <w:color w:val="19177c"/>
+    </w:rPr>
+  </w:style>
+  <w:style w:type="character" w:customStyle="1" w:styleId="ControlFlowTok">
+    <w:name w:val="ControlFlowTok"/>
+    <w:basedOn w:val="VerbatimChar"/>
+    <w:rPr>
+      <w:b/>
+      <w:color w:val="007020"/>
+    </w:rPr>
+  </w:style>
+  <w:style w:type="character" w:customStyle="1" w:styleId="OperatorTok">
+    <w:name w:val="OperatorTok"/>
+    <w:basedOn w:val="VerbatimChar"/>
+    <w:rPr>
+      <w:color w:val="666666"/>
+    </w:rPr>
+  </w:style>
+  <w:style w:type="character" w:customStyle="1" w:styleId="BuiltInTok">
+    <w:name w:val="BuiltInTok"/>
+    <w:basedOn w:val="VerbatimChar"/>
+    <w:rPr>
+      <w:color w:val="008000"/>
+    </w:rPr>
+  </w:style>
+  <w:style w:type="character" w:customStyle="1" w:styleId="ExtensionTok">
+    <w:name w:val="ExtensionTok"/>
+    <w:basedOn w:val="VerbatimChar"/>
+    <w:rPr/>
+  </w:style>
+  <w:style w:type="character" w:customStyle="1" w:styleId="PreprocessorTok">
+    <w:name w:val="PreprocessorTok"/>
+    <w:basedOn w:val="VerbatimChar"/>
+    <w:rPr>
+      <w:color w:val="bc7a00"/>
+    </w:rPr>
+  </w:style>
+  <w:style w:type="character" w:customStyle="1" w:styleId="AttributeTok">
+    <w:name w:val="AttributeTok"/>
+    <w:basedOn w:val="VerbatimChar"/>
+    <w:rPr>
+      <w:color w:val="7d9029"/>
+    </w:rPr>
+  </w:style>
+  <w:style w:type="character" w:customStyle="1" w:styleId="RegionMarkerTok">
+    <w:name w:val="RegionMarkerTok"/>
+    <w:basedOn w:val="VerbatimChar"/>
+    <w:rPr/>
+  </w:style>
+  <w:style w:type="character" w:customStyle="1" w:styleId="InformationTok">
+    <w:name w:val="InformationTok"/>
+    <w:basedOn w:val="VerbatimChar"/>
+    <w:rPr>
+      <w:b/>
+      <w:i/>
+      <w:color w:val="60a0b0"/>
+    </w:rPr>
+  </w:style>
+  <w:style w:type="character" w:customStyle="1" w:styleId="WarningTok">
+    <w:name w:val="WarningTok"/>
+    <w:basedOn w:val="VerbatimChar"/>
+    <w:rPr>
+      <w:b/>
+      <w:i/>
+      <w:color w:val="60a0b0"/>
+    </w:rPr>
+  </w:style>
+  <w:style w:type="character" w:customStyle="1" w:styleId="AlertTok">
+    <w:name w:val="AlertTok"/>
+    <w:basedOn w:val="VerbatimChar"/>
+    <w:rPr>
+      <w:b/>
+      <w:color w:val="ff0000"/>
+    </w:rPr>
+  </w:style>
+  <w:style w:type="character" w:customStyle="1" w:styleId="ErrorTok">
+    <w:name w:val="ErrorTok"/>
+    <w:basedOn w:val="VerbatimChar"/>
+    <w:rPr>
+      <w:b/>
+      <w:color w:val="ff0000"/>
+    </w:rPr>
+  </w:style>
+  <w:style w:type="character" w:customStyle="1" w:styleId="NormalTok">
+    <w:name w:val="NormalTok"/>
+    <w:basedOn w:val="VerbatimChar"/>
+    <w:rPr/>
   </w:style>
 </w:styles>
 </file>

</xml_diff>

<commit_message>
Refine title panel: real padding, metadata moved outside the colored box
</commit_message>
<xml_diff>
--- a/pandoc/reference.docx
+++ b/pandoc/reference.docx
@@ -908,15 +908,17 @@
     <w:qFormat/>
     <w:rsid w:val="00A10FD9"/>
     <w:pPr>
-      <w:spacing w:after="80" w:line="240" w:lineRule="auto"/>
+      <w:spacing w:after="320" w:before="320" w:line="276" w:lineRule="auto"/>
       <w:contextualSpacing/>
       <w:jc w:val="center"/>
-    </w:pPr>
-    <w:rPr>
-      <w:rFonts w:ascii="Calibri" w:asciiTheme="majorHAnsi" w:cs="Calibri" w:cstheme="majorBidi" w:eastAsia="Calibri" w:eastAsiaTheme="majorEastAsia" w:hAnsi="Calibri" w:hAnsiTheme="majorHAnsi"/>
+      <w:shd w:fill="3D1A5B" w:val="clear"/>
+      <w:ind w:left="180" w:right="180"/>
+    </w:pPr>
+    <w:rPr>
+      <w:rFonts w:asciiTheme="majorHAnsi" w:cstheme="majorBidi" w:eastAsiaTheme="majorEastAsia" w:hAnsiTheme="majorHAnsi"/>
       <w:b/>
-      <w:color w:val="A855F7"/>
-      <w:sz w:val="56"/>
+      <w:color w:val="FFFFFF"/>
+      <w:sz w:val="48"/>
       <w:szCs w:val="56"/>
     </w:rPr>
   </w:style>
@@ -974,11 +976,13 @@
     <w:pPr>
       <w:keepNext/>
       <w:keepLines/>
-    </w:pPr>
-    <w:rPr>
-      <w:rFonts w:ascii="Calibri" w:cs="Calibri" w:eastAsia="Calibri" w:hAnsi="Calibri"/>
+      <w:shd w:fill="auto" w:val="clear"/>
+      <w:spacing w:after="40" w:before="240"/>
+      <w:ind w:left="0" w:right="0"/>
+    </w:pPr>
+    <w:rPr>
       <w:color w:val="6B6B6B"/>
-      <w:sz w:val="24"/>
+      <w:sz w:val="22"/>
       <w:szCs w:val="24"/>
     </w:rPr>
   </w:style>
@@ -990,11 +994,13 @@
     <w:pPr>
       <w:keepNext/>
       <w:keepLines/>
-    </w:pPr>
-    <w:rPr>
-      <w:rFonts w:ascii="Calibri" w:cs="Calibri" w:eastAsia="Calibri" w:hAnsi="Calibri"/>
+      <w:shd w:fill="auto" w:val="clear"/>
+      <w:spacing w:after="280" w:before="0"/>
+      <w:ind w:left="0" w:right="0"/>
+    </w:pPr>
+    <w:rPr>
       <w:color w:val="6B6B6B"/>
-      <w:sz w:val="24"/>
+      <w:sz w:val="20"/>
       <w:szCs w:val="24"/>
     </w:rPr>
   </w:style>

</xml_diff>

<commit_message>
Center title vertically, anchor metadata near page bottom, suppress page-1 number
</commit_message>
<xml_diff>
--- a/pandoc/reference.docx
+++ b/pandoc/reference.docx
@@ -57,7 +57,7 @@
         <w:br w:type="page"/>
       </w:r>
     </w:p>
-    <w:bookmarkStart w:id="19" w:name="purpose"/>
+    <w:bookmarkStart w:id="21" w:name="purpose"/>
     <w:p>
       <w:pPr>
         <w:pStyle w:val="Heading2"/>
@@ -92,8 +92,8 @@
         <w:t xml:space="preserve">“who can touch what, and why.”</w:t>
       </w:r>
     </w:p>
-    <w:bookmarkEnd w:id="19"/>
-    <w:bookmarkStart w:id="22" w:name="scope"/>
+    <w:bookmarkEnd w:id="21"/>
+    <w:bookmarkStart w:id="24" w:name="scope"/>
     <w:p>
       <w:pPr>
         <w:pStyle w:val="Heading2"/>
@@ -128,7 +128,7 @@
         <w:t xml:space="preserve">governed separately.</w:t>
       </w:r>
     </w:p>
-    <w:bookmarkStart w:id="20" w:name="principle-of-least-privilege"/>
+    <w:bookmarkStart w:id="22" w:name="principle-of-least-privilege"/>
     <w:p>
       <w:pPr>
         <w:pStyle w:val="Heading3"/>
@@ -163,8 +163,8 @@
         <w:t xml:space="preserve">request approved by their manager and a member of the security team.</w:t>
       </w:r>
     </w:p>
-    <w:bookmarkEnd w:id="20"/>
-    <w:bookmarkStart w:id="21" w:name="default-deny"/>
+    <w:bookmarkEnd w:id="22"/>
+    <w:bookmarkStart w:id="23" w:name="default-deny"/>
     <w:p>
       <w:pPr>
         <w:pStyle w:val="Heading3"/>
@@ -193,9 +193,9 @@
         <w:t xml:space="preserve">access was itself deliberately scoped.</w:t>
       </w:r>
     </w:p>
-    <w:bookmarkEnd w:id="21"/>
-    <w:bookmarkEnd w:id="22"/>
-    <w:bookmarkStart w:id="23" w:name="access-review-cadence"/>
+    <w:bookmarkEnd w:id="23"/>
+    <w:bookmarkEnd w:id="24"/>
+    <w:bookmarkStart w:id="25" w:name="access-review-cadence"/>
     <w:p>
       <w:pPr>
         <w:pStyle w:val="Heading2"/>
@@ -451,8 +451,8 @@
         </w:tc>
       </w:tr>
     </w:tbl>
-    <w:bookmarkEnd w:id="23"/>
-    <w:bookmarkStart w:id="24" w:name="offboarding"/>
+    <w:bookmarkEnd w:id="25"/>
+    <w:bookmarkStart w:id="26" w:name="offboarding"/>
     <w:p>
       <w:pPr>
         <w:pStyle w:val="Heading2"/>
@@ -523,8 +523,8 @@
         <w:t xml:space="preserve">Physical badge and hardware returned or remotely wiped</w:t>
       </w:r>
     </w:p>
-    <w:bookmarkEnd w:id="24"/>
-    <w:bookmarkStart w:id="25" w:name="exceptions"/>
+    <w:bookmarkEnd w:id="26"/>
+    <w:bookmarkStart w:id="27" w:name="exceptions"/>
     <w:p>
       <w:pPr>
         <w:pStyle w:val="Heading2"/>
@@ -559,13 +559,18 @@
         <w:t xml:space="preserve">access reviews above.</w:t>
       </w:r>
     </w:p>
-    <w:bookmarkEnd w:id="25"/>
+    <w:bookmarkEnd w:id="27"/>
     <w:sectPr>
-      <w:footerReference r:id="rId9" w:type="default"/>
-      <w:headerReference r:id="rId10" w:type="default"/>
+      <w:footerReference r:id="rId9" w:type="first"/>
+      <w:footerReference r:id="rId10" w:type="default"/>
+      <w:headerReference r:id="rId11" w:type="first"/>
+      <w:headerReference r:id="rId12" w:type="default"/>
       <w:footnotePr>
         <w:numRestart w:val="eachSect"/>
       </w:footnotePr>
+      <w:pgSz w:h="15840" w:w="12240"/>
+      <w:pgMar w:bottom="1440" w:left="1440" w:right="1440" w:top="1440"/>
+      <w:titlePg/>
     </w:sectPr>
   </w:body>
 </w:document>
@@ -576,6 +581,17 @@
 </file>
 
 <file path=word/footer1.xml><?xml version="1.0" encoding="utf-8"?>
+<w:ftr xmlns:m="http://schemas.openxmlformats.org/officeDocument/2006/math" xmlns:mc="http://schemas.openxmlformats.org/markup-compatibility/2006" xmlns:mo="http://schemas.microsoft.com/office/mac/office/2008/main" xmlns:mv="urn:schemas-microsoft-com:mac:vml" xmlns:o="urn:schemas-microsoft-com:office:office" xmlns:r="http://schemas.openxmlformats.org/officeDocument/2006/relationships" xmlns:v="urn:schemas-microsoft-com:vml" xmlns:w10="urn:schemas-microsoft-com:office:word" xmlns:w14="http://schemas.microsoft.com/office/word/2010/wordml" xmlns:w="http://schemas.openxmlformats.org/wordprocessingml/2006/main" xmlns:wne="http://schemas.microsoft.com/office/word/2006/wordml" xmlns:wp14="http://schemas.microsoft.com/office/word/2010/wordprocessingDrawing" xmlns:wp="http://schemas.openxmlformats.org/drawingml/2006/wordprocessingDrawing" xmlns:wpc="http://schemas.microsoft.com/office/word/2010/wordprocessingCanvas" xmlns:wpg="http://schemas.microsoft.com/office/word/2010/wordprocessingGroup" xmlns:wpi="http://schemas.microsoft.com/office/word/2010/wordprocessingInk" xmlns:wps="http://schemas.microsoft.com/office/word/2010/wordprocessingShape" mc:Ignorable="w14 wp14">
+  <w:p>
+    <w:pPr>
+      <w:pStyle w:val="Footer"/>
+    </w:pPr>
+    <w:r/>
+  </w:p>
+</w:ftr>
+</file>
+
+<file path=word/footer2.xml><?xml version="1.0" encoding="utf-8"?>
 <w:ftr xmlns:m="http://schemas.openxmlformats.org/officeDocument/2006/math" xmlns:mc="http://schemas.openxmlformats.org/markup-compatibility/2006" xmlns:mo="http://schemas.microsoft.com/office/mac/office/2008/main" xmlns:mv="urn:schemas-microsoft-com:mac:vml" xmlns:o="urn:schemas-microsoft-com:office:office" xmlns:r="http://schemas.openxmlformats.org/officeDocument/2006/relationships" xmlns:v="urn:schemas-microsoft-com:vml" xmlns:w10="urn:schemas-microsoft-com:office:word" xmlns:w14="http://schemas.microsoft.com/office/word/2010/wordml" xmlns:w="http://schemas.openxmlformats.org/wordprocessingml/2006/main" xmlns:wne="http://schemas.microsoft.com/office/word/2006/wordml" xmlns:wp14="http://schemas.microsoft.com/office/word/2010/wordprocessingDrawing" xmlns:wp="http://schemas.openxmlformats.org/drawingml/2006/wordprocessingDrawing" xmlns:wpc="http://schemas.microsoft.com/office/word/2010/wordprocessingCanvas" xmlns:wpg="http://schemas.microsoft.com/office/word/2010/wordprocessingGroup" xmlns:wpi="http://schemas.microsoft.com/office/word/2010/wordprocessingInk" xmlns:wps="http://schemas.microsoft.com/office/word/2010/wordprocessingShape" mc:Ignorable="w14 wp14">
   <w:p>
     <w:pPr>
@@ -617,6 +633,51 @@
 </file>
 
 <file path=word/header1.xml><?xml version="1.0" encoding="utf-8"?>
+<w:hdr xmlns:m="http://schemas.openxmlformats.org/officeDocument/2006/math" xmlns:mc="http://schemas.openxmlformats.org/markup-compatibility/2006" xmlns:mo="http://schemas.microsoft.com/office/mac/office/2008/main" xmlns:mv="urn:schemas-microsoft-com:mac:vml" xmlns:o="urn:schemas-microsoft-com:office:office" xmlns:r="http://schemas.openxmlformats.org/officeDocument/2006/relationships" xmlns:v="urn:schemas-microsoft-com:vml" xmlns:w10="urn:schemas-microsoft-com:office:word" xmlns:w14="http://schemas.microsoft.com/office/word/2010/wordml" xmlns:w="http://schemas.openxmlformats.org/wordprocessingml/2006/main" xmlns:wne="http://schemas.microsoft.com/office/word/2006/wordml" xmlns:wp14="http://schemas.microsoft.com/office/word/2010/wordprocessingDrawing" xmlns:wp="http://schemas.openxmlformats.org/drawingml/2006/wordprocessingDrawing" xmlns:wpc="http://schemas.microsoft.com/office/word/2010/wordprocessingCanvas" xmlns:wpg="http://schemas.microsoft.com/office/word/2010/wordprocessingGroup" xmlns:wpi="http://schemas.microsoft.com/office/word/2010/wordprocessingInk" xmlns:wps="http://schemas.microsoft.com/office/word/2010/wordprocessingShape" mc:Ignorable="w14 wp14">
+  <w:p>
+    <w:pPr>
+      <w:pStyle w:val="Header"/>
+      <w:jc w:val="left"/>
+    </w:pPr>
+    <w:r>
+      <w:drawing>
+        <wp:inline xmlns:a="http://schemas.openxmlformats.org/drawingml/2006/main" xmlns:pic="http://schemas.openxmlformats.org/drawingml/2006/picture">
+          <wp:extent cx="678000" cy="180000"/>
+          <wp:docPr id="1" name="Picture 1"/>
+          <wp:cNvGraphicFramePr>
+            <a:graphicFrameLocks noChangeAspect="1"/>
+          </wp:cNvGraphicFramePr>
+          <a:graphic>
+            <a:graphicData uri="http://schemas.openxmlformats.org/drawingml/2006/picture">
+              <pic:pic>
+                <pic:nvPicPr>
+                  <pic:cNvPr id="0" name="tenx-logo-header.png"/>
+                  <pic:cNvPicPr/>
+                </pic:nvPicPr>
+                <pic:blipFill>
+                  <a:blip r:embed="rId1"/>
+                  <a:stretch>
+                    <a:fillRect/>
+                  </a:stretch>
+                </pic:blipFill>
+                <pic:spPr>
+                  <a:xfrm>
+                    <a:off x="0" y="0"/>
+                    <a:ext cx="678000" cy="180000"/>
+                  </a:xfrm>
+                  <a:prstGeom prst="rect"/>
+                </pic:spPr>
+              </pic:pic>
+            </a:graphicData>
+          </a:graphic>
+        </wp:inline>
+      </w:drawing>
+    </w:r>
+  </w:p>
+</w:hdr>
+</file>
+
+<file path=word/header2.xml><?xml version="1.0" encoding="utf-8"?>
 <w:hdr xmlns:m="http://schemas.openxmlformats.org/officeDocument/2006/math" xmlns:mc="http://schemas.openxmlformats.org/markup-compatibility/2006" xmlns:mo="http://schemas.microsoft.com/office/mac/office/2008/main" xmlns:mv="urn:schemas-microsoft-com:mac:vml" xmlns:o="urn:schemas-microsoft-com:office:office" xmlns:r="http://schemas.openxmlformats.org/officeDocument/2006/relationships" xmlns:v="urn:schemas-microsoft-com:vml" xmlns:w10="urn:schemas-microsoft-com:office:word" xmlns:w14="http://schemas.microsoft.com/office/word/2010/wordml" xmlns:w="http://schemas.openxmlformats.org/wordprocessingml/2006/main" xmlns:wne="http://schemas.microsoft.com/office/word/2006/wordml" xmlns:wp14="http://schemas.microsoft.com/office/word/2010/wordprocessingDrawing" xmlns:wp="http://schemas.openxmlformats.org/drawingml/2006/wordprocessingDrawing" xmlns:wpc="http://schemas.microsoft.com/office/word/2010/wordprocessingCanvas" xmlns:wpg="http://schemas.microsoft.com/office/word/2010/wordprocessingGroup" xmlns:wpi="http://schemas.microsoft.com/office/word/2010/wordprocessingInk" xmlns:wps="http://schemas.microsoft.com/office/word/2010/wordprocessingShape" mc:Ignorable="w14 wp14">
   <w:p>
     <w:pPr>
@@ -908,7 +969,7 @@
     <w:qFormat/>
     <w:rsid w:val="00A10FD9"/>
     <w:pPr>
-      <w:spacing w:after="320" w:before="320" w:line="276" w:lineRule="auto"/>
+      <w:spacing w:after="320" w:before="6000" w:line="276" w:lineRule="auto"/>
       <w:contextualSpacing/>
       <w:jc w:val="center"/>
       <w:shd w:fill="3D1A5B" w:val="clear"/>
@@ -977,7 +1038,7 @@
       <w:keepNext/>
       <w:keepLines/>
       <w:shd w:fill="auto" w:val="clear"/>
-      <w:spacing w:after="40" w:before="240"/>
+      <w:spacing w:after="40" w:before="4000"/>
       <w:ind w:left="0" w:right="0"/>
     </w:pPr>
     <w:rPr>
@@ -995,7 +1056,7 @@
       <w:keepNext/>
       <w:keepLines/>
       <w:shd w:fill="auto" w:val="clear"/>
-      <w:spacing w:after="280" w:before="0"/>
+      <w:spacing w:after="0" w:before="0"/>
       <w:ind w:left="0" w:right="0"/>
     </w:pPr>
     <w:rPr>

</xml_diff>

<commit_message>
Strip theme-font overrides so Calibri actually applies; unbold Author/Date
Pandoc's default styles carry w:asciiTheme etc. on the same rFonts
element as our literal Calibri values, and per ECMA-376 theme
attributes win when both are present — Title/Author/Date/H1/H2/
TOCHeading were silently rendering in the theme font. Strip the theme
attributes wherever we set literal fonts, and route Title/Author/Date
through the same font treatment (they previously never got one at
all). Also override the bold Author/Date inherit from Title (basedOn),
matching style_meta_line's explicit-override philosophy.
</commit_message>
<xml_diff>
--- a/pandoc/reference.docx
+++ b/pandoc/reference.docx
@@ -976,7 +976,7 @@
       <w:ind w:left="180" w:right="180"/>
     </w:pPr>
     <w:rPr>
-      <w:rFonts w:asciiTheme="majorHAnsi" w:cstheme="majorBidi" w:eastAsiaTheme="majorEastAsia" w:hAnsiTheme="majorHAnsi"/>
+      <w:rFonts w:ascii="Calibri" w:cs="Calibri" w:eastAsia="Calibri" w:hAnsi="Calibri"/>
       <w:b/>
       <w:color w:val="FFFFFF"/>
       <w:sz w:val="48"/>
@@ -1042,6 +1042,8 @@
       <w:ind w:left="0" w:right="0"/>
     </w:pPr>
     <w:rPr>
+      <w:rFonts w:ascii="Calibri" w:cs="Calibri" w:eastAsia="Calibri" w:hAnsi="Calibri"/>
+      <w:b w:val="0"/>
       <w:color w:val="6B6B6B"/>
       <w:sz w:val="22"/>
       <w:szCs w:val="24"/>
@@ -1060,6 +1062,8 @@
       <w:ind w:left="0" w:right="0"/>
     </w:pPr>
     <w:rPr>
+      <w:rFonts w:ascii="Calibri" w:cs="Calibri" w:eastAsia="Calibri" w:hAnsi="Calibri"/>
+      <w:b w:val="0"/>
       <w:color w:val="6B6B6B"/>
       <w:sz w:val="20"/>
       <w:szCs w:val="24"/>
@@ -1120,7 +1124,7 @@
       <w:outlineLvl w:val="0"/>
     </w:pPr>
     <w:rPr>
-      <w:rFonts w:ascii="Calibri" w:asciiTheme="majorHAnsi" w:cs="Calibri" w:cstheme="majorBidi" w:eastAsia="Calibri" w:eastAsiaTheme="majorEastAsia" w:hAnsi="Calibri" w:hAnsiTheme="majorHAnsi"/>
+      <w:rFonts w:ascii="Calibri" w:cs="Calibri" w:eastAsia="Calibri" w:hAnsi="Calibri"/>
       <w:b/>
       <w:color w:val="A855F7"/>
       <w:sz w:val="36"/>
@@ -1144,7 +1148,7 @@
       <w:outlineLvl w:val="1"/>
     </w:pPr>
     <w:rPr>
-      <w:rFonts w:ascii="Calibri" w:asciiTheme="majorHAnsi" w:cs="Calibri" w:cstheme="majorBidi" w:eastAsia="Calibri" w:eastAsiaTheme="majorEastAsia" w:hAnsi="Calibri" w:hAnsiTheme="majorHAnsi"/>
+      <w:rFonts w:ascii="Calibri" w:cs="Calibri" w:eastAsia="Calibri" w:hAnsi="Calibri"/>
       <w:b/>
       <w:color w:val="A855F7"/>
       <w:sz w:val="28"/>
@@ -1168,7 +1172,7 @@
       <w:outlineLvl w:val="2"/>
     </w:pPr>
     <w:rPr>
-      <w:rFonts w:ascii="Calibri" w:cs="Calibri" w:cstheme="majorBidi" w:eastAsia="Calibri" w:eastAsiaTheme="majorEastAsia" w:hAnsi="Calibri"/>
+      <w:rFonts w:ascii="Calibri" w:cs="Calibri" w:eastAsia="Calibri" w:hAnsi="Calibri"/>
       <w:b/>
       <w:color w:val="A855F7"/>
       <w:sz w:val="24"/>
@@ -1581,7 +1585,7 @@
       <w:outlineLvl w:val="9"/>
     </w:pPr>
     <w:rPr>
-      <w:rFonts w:ascii="Calibri" w:asciiTheme="majorHAnsi" w:cs="Calibri" w:cstheme="majorBidi" w:eastAsia="Calibri" w:eastAsiaTheme="majorEastAsia" w:hAnsi="Calibri" w:hAnsiTheme="majorHAnsi"/>
+      <w:rFonts w:ascii="Calibri" w:cs="Calibri" w:eastAsia="Calibri" w:hAnsi="Calibri"/>
       <w:b/>
       <w:bCs w:val="0"/>
       <w:color w:val="A855F7"/>

</xml_diff>

<commit_message>
Rework title-page composition: tighter upper-third position, thin accent rule above metadata, wider padding, standard update-fields flag
</commit_message>
<xml_diff>
--- a/pandoc/reference.docx
+++ b/pandoc/reference.docx
@@ -969,11 +969,11 @@
     <w:qFormat/>
     <w:rsid w:val="00A10FD9"/>
     <w:pPr>
-      <w:spacing w:after="320" w:before="6000" w:line="276" w:lineRule="auto"/>
+      <w:spacing w:after="480" w:before="2800" w:line="276" w:lineRule="auto"/>
       <w:contextualSpacing/>
       <w:jc w:val="center"/>
       <w:shd w:fill="3D1A5B" w:val="clear"/>
-      <w:ind w:left="180" w:right="180"/>
+      <w:ind w:left="320" w:right="320"/>
     </w:pPr>
     <w:rPr>
       <w:rFonts w:ascii="Calibri" w:cs="Calibri" w:eastAsia="Calibri" w:hAnsi="Calibri"/>
@@ -1040,6 +1040,9 @@
       <w:shd w:fill="auto" w:val="clear"/>
       <w:spacing w:after="40" w:before="4000"/>
       <w:ind w:left="0" w:right="0"/>
+      <w:pBdr>
+        <w:top w:color="3D1A5B" w:space="8" w:sz="8" w:val="single"/>
+      </w:pBdr>
     </w:pPr>
     <w:rPr>
       <w:rFonts w:ascii="Calibri" w:cs="Calibri" w:eastAsia="Calibri" w:hAnsi="Calibri"/>

</xml_diff>